<commit_message>
Complete premium dark mode overhaul, remove all emojis for cleaner UI, and fix friendship API routes
</commit_message>
<xml_diff>
--- a/plans/Requirements Document.v2.docx
+++ b/plans/Requirements Document.v2.docx
@@ -6,7 +6,7 @@
       <w:bookmarkStart w:id="0" w:name="_Toc221138259"/>
       <w:r>
         <w:rPr>
-          <w:rStyle w:val="Heading1Char"/>
+          <w:rStyle w:val="Balk1Char"/>
         </w:rPr>
         <w:t>Project name:</w:t>
       </w:r>
@@ -20,14 +20,14 @@
       <w:proofErr w:type="spellStart"/>
       <w:r>
         <w:rPr>
-          <w:rStyle w:val="Heading1Char"/>
+          <w:rStyle w:val="Balk1Char"/>
         </w:rPr>
         <w:t>Contributors</w:t>
       </w:r>
       <w:proofErr w:type="spellEnd"/>
       <w:r>
         <w:rPr>
-          <w:rStyle w:val="Heading1Char"/>
+          <w:rStyle w:val="Balk1Char"/>
           <w:rFonts w:asciiTheme="minorHAnsi" w:hAnsiTheme="minorHAnsi"/>
           <w:b/>
           <w:bCs/>
@@ -37,7 +37,7 @@
       <w:bookmarkEnd w:id="1"/>
       <w:r>
         <w:rPr>
-          <w:rStyle w:val="Heading1Char"/>
+          <w:rStyle w:val="Balk1Char"/>
           <w:rFonts w:asciiTheme="minorHAnsi" w:hAnsiTheme="minorHAnsi"/>
         </w:rPr>
         <w:t xml:space="preserve"> </w:t>
@@ -83,7 +83,7 @@
         <w:bookmarkStart w:id="2" w:name="_Toc221138261" w:displacedByCustomXml="prev"/>
         <w:p>
           <w:pPr>
-            <w:pStyle w:val="Heading1"/>
+            <w:pStyle w:val="Balk1"/>
           </w:pPr>
           <w:proofErr w:type="spellStart"/>
           <w:r>
@@ -105,7 +105,7 @@
         </w:p>
         <w:p>
           <w:pPr>
-            <w:pStyle w:val="TOC1"/>
+            <w:pStyle w:val="T1"/>
             <w:tabs>
               <w:tab w:val="right" w:leader="dot" w:pos="9736"/>
             </w:tabs>
@@ -127,7 +127,7 @@
           <w:hyperlink w:anchor="_Toc221138259" w:history="1">
             <w:r>
               <w:rPr>
-                <w:rStyle w:val="Hyperlink"/>
+                <w:rStyle w:val="Kpr"/>
                 <w:noProof/>
               </w:rPr>
               <w:t>Project name:</w:t>
@@ -184,7 +184,7 @@
         </w:p>
         <w:p>
           <w:pPr>
-            <w:pStyle w:val="TOC1"/>
+            <w:pStyle w:val="T1"/>
             <w:tabs>
               <w:tab w:val="right" w:leader="dot" w:pos="9736"/>
             </w:tabs>
@@ -197,14 +197,14 @@
           <w:hyperlink w:anchor="_Toc221138260" w:history="1">
             <w:r>
               <w:rPr>
-                <w:rStyle w:val="Hyperlink"/>
+                <w:rStyle w:val="Kpr"/>
                 <w:noProof/>
               </w:rPr>
               <w:t>Contributors</w:t>
             </w:r>
             <w:r>
               <w:rPr>
-                <w:rStyle w:val="Hyperlink"/>
+                <w:rStyle w:val="Kpr"/>
                 <w:b/>
                 <w:bCs/>
                 <w:noProof/>
@@ -263,7 +263,7 @@
         </w:p>
         <w:p>
           <w:pPr>
-            <w:pStyle w:val="TOC1"/>
+            <w:pStyle w:val="T1"/>
             <w:tabs>
               <w:tab w:val="right" w:leader="dot" w:pos="9736"/>
             </w:tabs>
@@ -276,7 +276,7 @@
           <w:hyperlink w:anchor="_Toc221138261" w:history="1">
             <w:r>
               <w:rPr>
-                <w:rStyle w:val="Hyperlink"/>
+                <w:rStyle w:val="Kpr"/>
                 <w:noProof/>
               </w:rPr>
               <w:t>Table of Contents:</w:t>
@@ -333,7 +333,7 @@
         </w:p>
         <w:p>
           <w:pPr>
-            <w:pStyle w:val="TOC1"/>
+            <w:pStyle w:val="T1"/>
             <w:tabs>
               <w:tab w:val="right" w:leader="dot" w:pos="9736"/>
             </w:tabs>
@@ -346,7 +346,7 @@
           <w:hyperlink w:anchor="_Toc221138262" w:history="1">
             <w:r>
               <w:rPr>
-                <w:rStyle w:val="Hyperlink"/>
+                <w:rStyle w:val="Kpr"/>
                 <w:noProof/>
               </w:rPr>
               <w:t>Functional Requirements:</w:t>
@@ -403,7 +403,7 @@
         </w:p>
         <w:p>
           <w:pPr>
-            <w:pStyle w:val="TOC1"/>
+            <w:pStyle w:val="T1"/>
             <w:tabs>
               <w:tab w:val="right" w:leader="dot" w:pos="9736"/>
             </w:tabs>
@@ -416,7 +416,7 @@
           <w:hyperlink w:anchor="_Toc221138263" w:history="1">
             <w:r>
               <w:rPr>
-                <w:rStyle w:val="Hyperlink"/>
+                <w:rStyle w:val="Kpr"/>
                 <w:noProof/>
               </w:rPr>
               <w:t>Non-Functional Requirements:</w:t>
@@ -473,7 +473,7 @@
         </w:p>
         <w:p>
           <w:pPr>
-            <w:pStyle w:val="TOC1"/>
+            <w:pStyle w:val="T1"/>
             <w:tabs>
               <w:tab w:val="right" w:leader="dot" w:pos="9736"/>
             </w:tabs>
@@ -486,7 +486,7 @@
           <w:hyperlink w:anchor="_Toc221138264" w:history="1">
             <w:r>
               <w:rPr>
-                <w:rStyle w:val="Hyperlink"/>
+                <w:rStyle w:val="Kpr"/>
                 <w:noProof/>
               </w:rPr>
               <w:t>Effort Estimations:</w:t>
@@ -543,7 +543,7 @@
         </w:p>
         <w:p>
           <w:pPr>
-            <w:pStyle w:val="TOC1"/>
+            <w:pStyle w:val="T1"/>
             <w:tabs>
               <w:tab w:val="right" w:leader="dot" w:pos="9736"/>
             </w:tabs>
@@ -556,7 +556,7 @@
           <w:hyperlink w:anchor="_Toc221138265" w:history="1">
             <w:r>
               <w:rPr>
-                <w:rStyle w:val="Hyperlink"/>
+                <w:rStyle w:val="Kpr"/>
                 <w:noProof/>
               </w:rPr>
               <w:t>Phase-Based Effort Table:</w:t>
@@ -613,7 +613,7 @@
         </w:p>
         <w:p>
           <w:pPr>
-            <w:pStyle w:val="TOC1"/>
+            <w:pStyle w:val="T1"/>
             <w:tabs>
               <w:tab w:val="right" w:leader="dot" w:pos="9736"/>
             </w:tabs>
@@ -626,7 +626,7 @@
           <w:hyperlink w:anchor="_Toc221138266" w:history="1">
             <w:r>
               <w:rPr>
-                <w:rStyle w:val="Hyperlink"/>
+                <w:rStyle w:val="Kpr"/>
                 <w:noProof/>
               </w:rPr>
               <w:t>Document Creation Task Matrix (Requirements Document)</w:t>
@@ -694,7 +694,7 @@
     </w:sdt>
     <w:p>
       <w:pPr>
-        <w:pStyle w:val="TOC1"/>
+        <w:pStyle w:val="T1"/>
         <w:tabs>
           <w:tab w:val="right" w:leader="dot" w:pos="9736"/>
         </w:tabs>
@@ -719,7 +719,7 @@
     </w:p>
     <w:p>
       <w:pPr>
-        <w:pStyle w:val="Heading1"/>
+        <w:pStyle w:val="Balk1"/>
       </w:pPr>
       <w:bookmarkStart w:id="3" w:name="_Toc221133075"/>
       <w:bookmarkStart w:id="4" w:name="_Toc221138262"/>
@@ -744,7 +744,7 @@
     </w:p>
     <w:p>
       <w:pPr>
-        <w:pStyle w:val="Heading3"/>
+        <w:pStyle w:val="Balk3"/>
         <w:pBdr>
           <w:top w:val="single" w:sz="2" w:space="0" w:color="E5E7EB"/>
           <w:left w:val="single" w:sz="2" w:space="0" w:color="E5E7EB"/>
@@ -8217,7 +8217,7 @@
     </w:p>
     <w:p>
       <w:pPr>
-        <w:pStyle w:val="Heading1"/>
+        <w:pStyle w:val="Balk1"/>
       </w:pPr>
       <w:bookmarkStart w:id="5" w:name="_Toc221133076"/>
       <w:bookmarkStart w:id="6" w:name="_Toc221138263"/>
@@ -8436,6 +8436,7 @@
               <w:t xml:space="preserve">: API </w:t>
             </w:r>
             <w:proofErr w:type="spellStart"/>
+            <w:proofErr w:type="gramStart"/>
             <w:r>
               <w:rPr>
                 <w:rFonts w:ascii="Times New Roman" w:eastAsia="Times New Roman" w:hAnsi="Times New Roman" w:cs="Times New Roman"/>
@@ -8466,37 +8467,9 @@
                 <w:lang w:val="en-US"/>
                 <w14:ligatures w14:val="none"/>
               </w:rPr>
-              <w:t>?page=</w:t>
-            </w:r>
-            <w:r>
-              <w:rPr>
-                <w:rFonts w:ascii="Times New Roman" w:eastAsia="Times New Roman" w:hAnsi="Times New Roman" w:cs="Times New Roman"/>
-                <w:kern w:val="0"/>
-                <w:lang w:val="en-US"/>
-                <w14:ligatures w14:val="none"/>
-              </w:rPr>
-              <w:t> </w:t>
-            </w:r>
-            <w:proofErr w:type="spellStart"/>
-            <w:r>
-              <w:rPr>
-                <w:rFonts w:ascii="Times New Roman" w:eastAsia="Times New Roman" w:hAnsi="Times New Roman" w:cs="Times New Roman"/>
-                <w:kern w:val="0"/>
-                <w:lang w:val="en-US"/>
-                <w14:ligatures w14:val="none"/>
-              </w:rPr>
-              <w:t>ve</w:t>
-            </w:r>
-            <w:proofErr w:type="spellEnd"/>
-            <w:r>
-              <w:rPr>
-                <w:rFonts w:ascii="Times New Roman" w:eastAsia="Times New Roman" w:hAnsi="Times New Roman" w:cs="Times New Roman"/>
-                <w:kern w:val="0"/>
-                <w:lang w:val="en-US"/>
-                <w14:ligatures w14:val="none"/>
-              </w:rPr>
-              <w:t> </w:t>
-            </w:r>
+              <w:t>?page</w:t>
+            </w:r>
+            <w:proofErr w:type="gramEnd"/>
             <w:r>
               <w:rPr>
                 <w:rFonts w:ascii="Consolas" w:eastAsia="Times New Roman" w:hAnsi="Consolas" w:cs="Courier New"/>
@@ -8508,9 +8481,38 @@
                 <w:lang w:val="en-US"/>
                 <w14:ligatures w14:val="none"/>
               </w:rPr>
-              <w:t>?</w:t>
-            </w:r>
-            <w:proofErr w:type="spellStart"/>
+              <w:t>=</w:t>
+            </w:r>
+            <w:r>
+              <w:rPr>
+                <w:rFonts w:ascii="Times New Roman" w:eastAsia="Times New Roman" w:hAnsi="Times New Roman" w:cs="Times New Roman"/>
+                <w:kern w:val="0"/>
+                <w:lang w:val="en-US"/>
+                <w14:ligatures w14:val="none"/>
+              </w:rPr>
+              <w:t> </w:t>
+            </w:r>
+            <w:proofErr w:type="spellStart"/>
+            <w:proofErr w:type="gramStart"/>
+            <w:r>
+              <w:rPr>
+                <w:rFonts w:ascii="Times New Roman" w:eastAsia="Times New Roman" w:hAnsi="Times New Roman" w:cs="Times New Roman"/>
+                <w:kern w:val="0"/>
+                <w:lang w:val="en-US"/>
+                <w14:ligatures w14:val="none"/>
+              </w:rPr>
+              <w:t>ve</w:t>
+            </w:r>
+            <w:proofErr w:type="spellEnd"/>
+            <w:r>
+              <w:rPr>
+                <w:rFonts w:ascii="Times New Roman" w:eastAsia="Times New Roman" w:hAnsi="Times New Roman" w:cs="Times New Roman"/>
+                <w:kern w:val="0"/>
+                <w:lang w:val="en-US"/>
+                <w14:ligatures w14:val="none"/>
+              </w:rPr>
+              <w:t> </w:t>
+            </w:r>
             <w:r>
               <w:rPr>
                 <w:rFonts w:ascii="Consolas" w:eastAsia="Times New Roman" w:hAnsi="Consolas" w:cs="Courier New"/>
@@ -8522,7 +8524,35 @@
                 <w:lang w:val="en-US"/>
                 <w14:ligatures w14:val="none"/>
               </w:rPr>
-              <w:t>per_page</w:t>
+              <w:t>?</w:t>
+            </w:r>
+            <w:proofErr w:type="spellStart"/>
+            <w:r>
+              <w:rPr>
+                <w:rFonts w:ascii="Consolas" w:eastAsia="Times New Roman" w:hAnsi="Consolas" w:cs="Courier New"/>
+                <w:color w:val="D7BA7D"/>
+                <w:kern w:val="0"/>
+                <w:sz w:val="22"/>
+                <w:szCs w:val="22"/>
+                <w:bdr w:val="single" w:sz="2" w:space="0" w:color="E5E7EB" w:frame="1"/>
+                <w:lang w:val="en-US"/>
+                <w14:ligatures w14:val="none"/>
+              </w:rPr>
+              <w:t>per</w:t>
+            </w:r>
+            <w:proofErr w:type="gramEnd"/>
+            <w:r>
+              <w:rPr>
+                <w:rFonts w:ascii="Consolas" w:eastAsia="Times New Roman" w:hAnsi="Consolas" w:cs="Courier New"/>
+                <w:color w:val="D7BA7D"/>
+                <w:kern w:val="0"/>
+                <w:sz w:val="22"/>
+                <w:szCs w:val="22"/>
+                <w:bdr w:val="single" w:sz="2" w:space="0" w:color="E5E7EB" w:frame="1"/>
+                <w:lang w:val="en-US"/>
+                <w14:ligatures w14:val="none"/>
+              </w:rPr>
+              <w:t>_page</w:t>
             </w:r>
             <w:proofErr w:type="spellEnd"/>
             <w:r>
@@ -12070,28 +12100,28 @@
     <w:p/>
     <w:p>
       <w:pPr>
-        <w:pStyle w:val="Heading1"/>
+        <w:pStyle w:val="Balk1"/>
       </w:pPr>
       <w:bookmarkStart w:id="7" w:name="_Toc221133077"/>
       <w:bookmarkStart w:id="8" w:name="_Toc221138264"/>
       <w:proofErr w:type="spellStart"/>
       <w:r>
         <w:rPr>
-          <w:rStyle w:val="Heading1Char"/>
+          <w:rStyle w:val="Balk1Char"/>
         </w:rPr>
         <w:t>Effort</w:t>
       </w:r>
       <w:proofErr w:type="spellEnd"/>
       <w:r>
         <w:rPr>
-          <w:rStyle w:val="Heading1Char"/>
+          <w:rStyle w:val="Balk1Char"/>
         </w:rPr>
         <w:t xml:space="preserve"> </w:t>
       </w:r>
       <w:proofErr w:type="spellStart"/>
       <w:r>
         <w:rPr>
-          <w:rStyle w:val="Heading1Char"/>
+          <w:rStyle w:val="Balk1Char"/>
         </w:rPr>
         <w:t>Estimations</w:t>
       </w:r>
@@ -12207,7 +12237,7 @@
     <w:p/>
     <w:p>
       <w:pPr>
-        <w:pStyle w:val="Heading1"/>
+        <w:pStyle w:val="Balk1"/>
       </w:pPr>
       <w:bookmarkStart w:id="9" w:name="_Toc221133078"/>
       <w:bookmarkStart w:id="10" w:name="_Toc221138265"/>
@@ -12991,7 +13021,7 @@
     <w:p/>
     <w:p>
       <w:pPr>
-        <w:pStyle w:val="Heading1"/>
+        <w:pStyle w:val="Balk1"/>
       </w:pPr>
       <w:bookmarkStart w:id="11" w:name="_Toc221133079"/>
       <w:bookmarkStart w:id="12" w:name="_Toc221138266"/>
@@ -13048,159 +13078,119 @@
     </w:p>
     <w:tbl>
       <w:tblPr>
-        <w:tblW w:w="8554" w:type="dxa"/>
+        <w:tblW w:w="0" w:type="auto"/>
         <w:tblCellSpacing w:w="15" w:type="dxa"/>
-        <w:tblInd w:w="597" w:type="dxa"/>
+        <w:tblBorders>
+          <w:top w:val="single" w:sz="4" w:space="0" w:color="auto"/>
+          <w:left w:val="single" w:sz="4" w:space="0" w:color="auto"/>
+          <w:bottom w:val="single" w:sz="4" w:space="0" w:color="auto"/>
+          <w:right w:val="single" w:sz="4" w:space="0" w:color="auto"/>
+          <w:insideH w:val="single" w:sz="4" w:space="0" w:color="auto"/>
+          <w:insideV w:val="single" w:sz="4" w:space="0" w:color="auto"/>
+        </w:tblBorders>
         <w:tblCellMar>
-          <w:left w:w="0" w:type="dxa"/>
-          <w:right w:w="0" w:type="dxa"/>
+          <w:top w:w="15" w:type="dxa"/>
+          <w:left w:w="15" w:type="dxa"/>
+          <w:bottom w:w="15" w:type="dxa"/>
+          <w:right w:w="15" w:type="dxa"/>
         </w:tblCellMar>
         <w:tblLook w:val="04A0" w:firstRow="1" w:lastRow="0" w:firstColumn="1" w:lastColumn="0" w:noHBand="0" w:noVBand="1"/>
       </w:tblPr>
       <w:tblGrid>
-        <w:gridCol w:w="5043"/>
-        <w:gridCol w:w="3511"/>
+        <w:gridCol w:w="3334"/>
+        <w:gridCol w:w="4131"/>
       </w:tblGrid>
       <w:tr>
         <w:trPr>
-          <w:trHeight w:val="634"/>
           <w:tblHeader/>
           <w:tblCellSpacing w:w="15" w:type="dxa"/>
         </w:trPr>
         <w:tc>
           <w:tcPr>
             <w:tcW w:w="0" w:type="auto"/>
-            <w:tcBorders>
-              <w:top w:val="single" w:sz="6" w:space="0" w:color="auto"/>
-              <w:left w:val="single" w:sz="6" w:space="0" w:color="auto"/>
-              <w:bottom w:val="single" w:sz="6" w:space="0" w:color="auto"/>
-              <w:right w:val="single" w:sz="6" w:space="0" w:color="auto"/>
-            </w:tcBorders>
-            <w:tcMar>
-              <w:top w:w="120" w:type="dxa"/>
-              <w:left w:w="180" w:type="dxa"/>
-              <w:bottom w:w="120" w:type="dxa"/>
-              <w:right w:w="180" w:type="dxa"/>
-            </w:tcMar>
-            <w:vAlign w:val="center"/>
-            <w:hideMark/>
-          </w:tcPr>
-          <w:p>
-            <w:pPr>
+            <w:vAlign w:val="center"/>
+            <w:hideMark/>
+          </w:tcPr>
+          <w:p>
+            <w:pPr>
+              <w:spacing w:after="0" w:line="240" w:lineRule="auto"/>
               <w:jc w:val="center"/>
               <w:rPr>
+                <w:rFonts w:ascii="Times New Roman" w:eastAsia="Times New Roman" w:hAnsi="Times New Roman" w:cs="Times New Roman"/>
                 <w:b/>
                 <w:bCs/>
-                <w:color w:val="0F4761" w:themeColor="accent1" w:themeShade="BF"/>
-              </w:rPr>
-            </w:pPr>
-            <w:proofErr w:type="spellStart"/>
-            <w:r>
-              <w:rPr>
+                <w:kern w:val="0"/>
+                <w:lang w:eastAsia="tr-TR"/>
+                <w14:ligatures w14:val="none"/>
+              </w:rPr>
+            </w:pPr>
+            <w:proofErr w:type="spellStart"/>
+            <w:r>
+              <w:rPr>
+                <w:rFonts w:ascii="Times New Roman" w:eastAsia="Times New Roman" w:hAnsi="Times New Roman" w:cs="Times New Roman"/>
                 <w:b/>
                 <w:bCs/>
-                <w:color w:val="0F4761" w:themeColor="accent1" w:themeShade="BF"/>
+                <w:kern w:val="0"/>
+                <w:lang w:eastAsia="tr-TR"/>
+                <w14:ligatures w14:val="none"/>
               </w:rPr>
               <w:t>Task</w:t>
             </w:r>
             <w:proofErr w:type="spellEnd"/>
-            <w:r>
-              <w:rPr>
+          </w:p>
+        </w:tc>
+        <w:tc>
+          <w:tcPr>
+            <w:tcW w:w="4086" w:type="dxa"/>
+            <w:vAlign w:val="center"/>
+            <w:hideMark/>
+          </w:tcPr>
+          <w:p>
+            <w:pPr>
+              <w:spacing w:after="0" w:line="240" w:lineRule="auto"/>
+              <w:jc w:val="center"/>
+              <w:rPr>
+                <w:rFonts w:ascii="Times New Roman" w:eastAsia="Times New Roman" w:hAnsi="Times New Roman" w:cs="Times New Roman"/>
                 <w:b/>
                 <w:bCs/>
-                <w:color w:val="0F4761" w:themeColor="accent1" w:themeShade="BF"/>
-              </w:rPr>
-              <w:t xml:space="preserve"> (</w:t>
-            </w:r>
-            <w:proofErr w:type="spellStart"/>
-            <w:r>
-              <w:rPr>
+                <w:kern w:val="0"/>
+                <w:lang w:eastAsia="tr-TR"/>
+                <w14:ligatures w14:val="none"/>
+              </w:rPr>
+            </w:pPr>
+            <w:proofErr w:type="spellStart"/>
+            <w:r>
+              <w:rPr>
+                <w:rFonts w:ascii="Times New Roman" w:eastAsia="Times New Roman" w:hAnsi="Times New Roman" w:cs="Times New Roman"/>
                 <w:b/>
                 <w:bCs/>
-                <w:color w:val="0F4761" w:themeColor="accent1" w:themeShade="BF"/>
-              </w:rPr>
-              <w:t>Document</w:t>
-            </w:r>
-            <w:proofErr w:type="spellEnd"/>
-            <w:r>
-              <w:rPr>
+                <w:kern w:val="0"/>
+                <w:lang w:eastAsia="tr-TR"/>
+                <w14:ligatures w14:val="none"/>
+              </w:rPr>
+              <w:t>Responsible</w:t>
+            </w:r>
+            <w:proofErr w:type="spellEnd"/>
+            <w:r>
+              <w:rPr>
+                <w:rFonts w:ascii="Times New Roman" w:eastAsia="Times New Roman" w:hAnsi="Times New Roman" w:cs="Times New Roman"/>
                 <w:b/>
                 <w:bCs/>
-                <w:color w:val="0F4761" w:themeColor="accent1" w:themeShade="BF"/>
-              </w:rPr>
-              <w:t xml:space="preserve"> </w:t>
-            </w:r>
-            <w:proofErr w:type="spellStart"/>
-            <w:r>
-              <w:rPr>
+                <w:kern w:val="0"/>
+                <w:lang w:eastAsia="tr-TR"/>
+                <w14:ligatures w14:val="none"/>
+              </w:rPr>
+              <w:t xml:space="preserve"> Team </w:t>
+            </w:r>
+            <w:proofErr w:type="spellStart"/>
+            <w:r>
+              <w:rPr>
+                <w:rFonts w:ascii="Times New Roman" w:eastAsia="Times New Roman" w:hAnsi="Times New Roman" w:cs="Times New Roman"/>
                 <w:b/>
                 <w:bCs/>
-                <w:color w:val="0F4761" w:themeColor="accent1" w:themeShade="BF"/>
-              </w:rPr>
-              <w:t>Creation</w:t>
-            </w:r>
-            <w:proofErr w:type="spellEnd"/>
-            <w:r>
-              <w:rPr>
-                <w:b/>
-                <w:bCs/>
-                <w:color w:val="0F4761" w:themeColor="accent1" w:themeShade="BF"/>
-              </w:rPr>
-              <w:t>)</w:t>
-            </w:r>
-          </w:p>
-        </w:tc>
-        <w:tc>
-          <w:tcPr>
-            <w:tcW w:w="0" w:type="auto"/>
-            <w:tcBorders>
-              <w:top w:val="single" w:sz="6" w:space="0" w:color="auto"/>
-              <w:left w:val="single" w:sz="6" w:space="0" w:color="auto"/>
-              <w:bottom w:val="single" w:sz="6" w:space="0" w:color="auto"/>
-              <w:right w:val="single" w:sz="6" w:space="0" w:color="auto"/>
-            </w:tcBorders>
-            <w:tcMar>
-              <w:top w:w="120" w:type="dxa"/>
-              <w:left w:w="180" w:type="dxa"/>
-              <w:bottom w:w="120" w:type="dxa"/>
-              <w:right w:w="180" w:type="dxa"/>
-            </w:tcMar>
-            <w:vAlign w:val="center"/>
-            <w:hideMark/>
-          </w:tcPr>
-          <w:p>
-            <w:pPr>
-              <w:jc w:val="center"/>
-              <w:rPr>
-                <w:b/>
-                <w:bCs/>
-                <w:color w:val="0F4761" w:themeColor="accent1" w:themeShade="BF"/>
-              </w:rPr>
-            </w:pPr>
-            <w:proofErr w:type="spellStart"/>
-            <w:r>
-              <w:rPr>
-                <w:b/>
-                <w:bCs/>
-                <w:color w:val="0F4761" w:themeColor="accent1" w:themeShade="BF"/>
-              </w:rPr>
-              <w:t>Responsible</w:t>
-            </w:r>
-            <w:proofErr w:type="spellEnd"/>
-            <w:r>
-              <w:rPr>
-                <w:b/>
-                <w:bCs/>
-                <w:color w:val="0F4761" w:themeColor="accent1" w:themeShade="BF"/>
-              </w:rPr>
-              <w:t xml:space="preserve"> Team </w:t>
-            </w:r>
-            <w:proofErr w:type="spellStart"/>
-            <w:r>
-              <w:rPr>
-                <w:b/>
-                <w:bCs/>
-                <w:color w:val="0F4761" w:themeColor="accent1" w:themeShade="BF"/>
+                <w:kern w:val="0"/>
+                <w:lang w:eastAsia="tr-TR"/>
+                <w14:ligatures w14:val="none"/>
               </w:rPr>
               <w:t>Member</w:t>
             </w:r>
@@ -13210,526 +13200,785 @@
       </w:tr>
       <w:tr>
         <w:trPr>
-          <w:trHeight w:val="634"/>
           <w:tblCellSpacing w:w="15" w:type="dxa"/>
         </w:trPr>
         <w:tc>
           <w:tcPr>
             <w:tcW w:w="0" w:type="auto"/>
-            <w:tcBorders>
-              <w:top w:val="single" w:sz="6" w:space="0" w:color="auto"/>
-              <w:left w:val="single" w:sz="6" w:space="0" w:color="auto"/>
-              <w:bottom w:val="single" w:sz="6" w:space="0" w:color="auto"/>
-              <w:right w:val="single" w:sz="6" w:space="0" w:color="auto"/>
-            </w:tcBorders>
-            <w:tcMar>
-              <w:top w:w="120" w:type="dxa"/>
-              <w:left w:w="180" w:type="dxa"/>
-              <w:bottom w:w="120" w:type="dxa"/>
-              <w:right w:w="180" w:type="dxa"/>
-            </w:tcMar>
-            <w:vAlign w:val="center"/>
-            <w:hideMark/>
-          </w:tcPr>
-          <w:p>
-            <w:pPr>
-              <w:jc w:val="center"/>
-              <w:rPr>
-                <w:b/>
-                <w:bCs/>
-                <w:color w:val="0F4761" w:themeColor="accent1" w:themeShade="BF"/>
-              </w:rPr>
-            </w:pPr>
-            <w:proofErr w:type="spellStart"/>
-            <w:r>
-              <w:rPr>
-                <w:b/>
-                <w:bCs/>
-                <w:color w:val="0F4761" w:themeColor="accent1" w:themeShade="BF"/>
-              </w:rPr>
-              <w:t>Functional</w:t>
-            </w:r>
-            <w:proofErr w:type="spellEnd"/>
-            <w:r>
-              <w:rPr>
-                <w:b/>
-                <w:bCs/>
-                <w:color w:val="0F4761" w:themeColor="accent1" w:themeShade="BF"/>
-              </w:rPr>
-              <w:t xml:space="preserve"> </w:t>
-            </w:r>
-            <w:proofErr w:type="spellStart"/>
-            <w:r>
-              <w:rPr>
-                <w:b/>
-                <w:bCs/>
-                <w:color w:val="0F4761" w:themeColor="accent1" w:themeShade="BF"/>
-              </w:rPr>
-              <w:t>Requirements</w:t>
-            </w:r>
-            <w:proofErr w:type="spellEnd"/>
-            <w:r>
-              <w:rPr>
-                <w:b/>
-                <w:bCs/>
-                <w:color w:val="0F4761" w:themeColor="accent1" w:themeShade="BF"/>
-              </w:rPr>
-              <w:t xml:space="preserve"> Definition</w:t>
-            </w:r>
-          </w:p>
-        </w:tc>
-        <w:tc>
-          <w:tcPr>
-            <w:tcW w:w="0" w:type="auto"/>
-            <w:tcBorders>
-              <w:top w:val="single" w:sz="6" w:space="0" w:color="auto"/>
-              <w:left w:val="single" w:sz="6" w:space="0" w:color="auto"/>
-              <w:bottom w:val="single" w:sz="6" w:space="0" w:color="auto"/>
-              <w:right w:val="single" w:sz="6" w:space="0" w:color="auto"/>
-            </w:tcBorders>
-            <w:tcMar>
-              <w:top w:w="120" w:type="dxa"/>
-              <w:left w:w="180" w:type="dxa"/>
-              <w:bottom w:w="120" w:type="dxa"/>
-              <w:right w:w="180" w:type="dxa"/>
-            </w:tcMar>
-            <w:vAlign w:val="center"/>
-            <w:hideMark/>
-          </w:tcPr>
-          <w:p>
-            <w:pPr>
-              <w:jc w:val="center"/>
-            </w:pPr>
-            <w:r>
-              <w:t>Tüm Ekip</w:t>
+            <w:vAlign w:val="center"/>
+            <w:hideMark/>
+          </w:tcPr>
+          <w:p>
+            <w:pPr>
+              <w:spacing w:after="0" w:line="240" w:lineRule="auto"/>
+              <w:rPr>
+                <w:rFonts w:ascii="Times New Roman" w:eastAsia="Times New Roman" w:hAnsi="Times New Roman" w:cs="Times New Roman"/>
+                <w:kern w:val="0"/>
+                <w:lang w:eastAsia="tr-TR"/>
+                <w14:ligatures w14:val="none"/>
+              </w:rPr>
+            </w:pPr>
+            <w:r>
+              <w:rPr>
+                <w:rFonts w:ascii="Times New Roman" w:eastAsia="Times New Roman" w:hAnsi="Times New Roman" w:cs="Times New Roman"/>
+                <w:kern w:val="0"/>
+                <w:lang w:eastAsia="tr-TR"/>
+                <w14:ligatures w14:val="none"/>
+              </w:rPr>
+              <w:t xml:space="preserve">Project Name &amp; General </w:t>
+            </w:r>
+            <w:proofErr w:type="spellStart"/>
+            <w:r>
+              <w:rPr>
+                <w:rFonts w:ascii="Times New Roman" w:eastAsia="Times New Roman" w:hAnsi="Times New Roman" w:cs="Times New Roman"/>
+                <w:kern w:val="0"/>
+                <w:lang w:eastAsia="tr-TR"/>
+                <w14:ligatures w14:val="none"/>
+              </w:rPr>
+              <w:t>Concept</w:t>
+            </w:r>
+            <w:proofErr w:type="spellEnd"/>
+          </w:p>
+        </w:tc>
+        <w:tc>
+          <w:tcPr>
+            <w:tcW w:w="4086" w:type="dxa"/>
+            <w:vAlign w:val="center"/>
+            <w:hideMark/>
+          </w:tcPr>
+          <w:p>
+            <w:pPr>
+              <w:spacing w:after="0" w:line="240" w:lineRule="auto"/>
+              <w:rPr>
+                <w:rFonts w:ascii="Times New Roman" w:eastAsia="Times New Roman" w:hAnsi="Times New Roman" w:cs="Times New Roman"/>
+                <w:kern w:val="0"/>
+                <w:lang w:eastAsia="tr-TR"/>
+                <w14:ligatures w14:val="none"/>
+              </w:rPr>
+            </w:pPr>
+            <w:proofErr w:type="spellStart"/>
+            <w:r>
+              <w:rPr>
+                <w:rFonts w:ascii="Times New Roman" w:eastAsia="Times New Roman" w:hAnsi="Times New Roman" w:cs="Times New Roman"/>
+                <w:kern w:val="0"/>
+                <w:lang w:eastAsia="tr-TR"/>
+                <w14:ligatures w14:val="none"/>
+              </w:rPr>
+              <w:t>Şevda</w:t>
+            </w:r>
+            <w:proofErr w:type="spellEnd"/>
+            <w:r>
+              <w:rPr>
+                <w:rFonts w:ascii="Times New Roman" w:eastAsia="Times New Roman" w:hAnsi="Times New Roman" w:cs="Times New Roman"/>
+                <w:kern w:val="0"/>
+                <w:lang w:eastAsia="tr-TR"/>
+                <w14:ligatures w14:val="none"/>
+              </w:rPr>
+              <w:t xml:space="preserve"> Yağmur Asal</w:t>
+            </w:r>
+            <w:r>
+              <w:rPr>
+                <w:rFonts w:ascii="Times New Roman" w:eastAsia="Times New Roman" w:hAnsi="Times New Roman" w:cs="Times New Roman"/>
+                <w:kern w:val="0"/>
+                <w:lang w:eastAsia="tr-TR"/>
+                <w14:ligatures w14:val="none"/>
+              </w:rPr>
+              <w:t>+ Mert Dönmez</w:t>
             </w:r>
           </w:p>
         </w:tc>
       </w:tr>
       <w:tr>
         <w:trPr>
-          <w:trHeight w:val="634"/>
           <w:tblCellSpacing w:w="15" w:type="dxa"/>
         </w:trPr>
         <w:tc>
           <w:tcPr>
             <w:tcW w:w="0" w:type="auto"/>
-            <w:tcBorders>
-              <w:top w:val="single" w:sz="6" w:space="0" w:color="auto"/>
-              <w:left w:val="single" w:sz="6" w:space="0" w:color="auto"/>
-              <w:bottom w:val="single" w:sz="6" w:space="0" w:color="auto"/>
-              <w:right w:val="single" w:sz="6" w:space="0" w:color="auto"/>
-            </w:tcBorders>
-            <w:tcMar>
-              <w:top w:w="120" w:type="dxa"/>
-              <w:left w:w="180" w:type="dxa"/>
-              <w:bottom w:w="120" w:type="dxa"/>
-              <w:right w:w="180" w:type="dxa"/>
-            </w:tcMar>
-            <w:vAlign w:val="center"/>
-            <w:hideMark/>
-          </w:tcPr>
-          <w:p>
-            <w:pPr>
-              <w:jc w:val="center"/>
-              <w:rPr>
-                <w:b/>
-                <w:bCs/>
-                <w:color w:val="0F4761" w:themeColor="accent1" w:themeShade="BF"/>
-              </w:rPr>
-            </w:pPr>
-            <w:proofErr w:type="spellStart"/>
-            <w:r>
-              <w:rPr>
-                <w:b/>
-                <w:bCs/>
-                <w:color w:val="0F4761" w:themeColor="accent1" w:themeShade="BF"/>
-              </w:rPr>
-              <w:t>Non-Functional</w:t>
-            </w:r>
-            <w:proofErr w:type="spellEnd"/>
-            <w:r>
-              <w:rPr>
-                <w:b/>
-                <w:bCs/>
-                <w:color w:val="0F4761" w:themeColor="accent1" w:themeShade="BF"/>
-              </w:rPr>
-              <w:t xml:space="preserve"> </w:t>
-            </w:r>
-            <w:proofErr w:type="spellStart"/>
-            <w:r>
-              <w:rPr>
-                <w:b/>
-                <w:bCs/>
-                <w:color w:val="0F4761" w:themeColor="accent1" w:themeShade="BF"/>
-              </w:rPr>
-              <w:t>Requirements</w:t>
-            </w:r>
-            <w:proofErr w:type="spellEnd"/>
-            <w:r>
-              <w:rPr>
-                <w:b/>
-                <w:bCs/>
-                <w:color w:val="0F4761" w:themeColor="accent1" w:themeShade="BF"/>
-              </w:rPr>
-              <w:t xml:space="preserve"> Definition</w:t>
-            </w:r>
-          </w:p>
-        </w:tc>
-        <w:tc>
-          <w:tcPr>
-            <w:tcW w:w="0" w:type="auto"/>
-            <w:tcBorders>
-              <w:top w:val="single" w:sz="6" w:space="0" w:color="auto"/>
-              <w:left w:val="single" w:sz="6" w:space="0" w:color="auto"/>
-              <w:bottom w:val="single" w:sz="6" w:space="0" w:color="auto"/>
-              <w:right w:val="single" w:sz="6" w:space="0" w:color="auto"/>
-            </w:tcBorders>
-            <w:tcMar>
-              <w:top w:w="120" w:type="dxa"/>
-              <w:left w:w="180" w:type="dxa"/>
-              <w:bottom w:w="120" w:type="dxa"/>
-              <w:right w:w="180" w:type="dxa"/>
-            </w:tcMar>
-            <w:vAlign w:val="center"/>
-            <w:hideMark/>
-          </w:tcPr>
-          <w:p>
-            <w:pPr>
-              <w:jc w:val="center"/>
-            </w:pPr>
-            <w:r>
-              <w:t>Mert D</w:t>
-            </w:r>
-            <w:r>
-              <w:t>ö</w:t>
-            </w:r>
-            <w:r>
-              <w:t>nmez</w:t>
-            </w:r>
+            <w:vAlign w:val="center"/>
+            <w:hideMark/>
+          </w:tcPr>
+          <w:p>
+            <w:pPr>
+              <w:spacing w:after="0" w:line="240" w:lineRule="auto"/>
+              <w:rPr>
+                <w:rFonts w:ascii="Times New Roman" w:eastAsia="Times New Roman" w:hAnsi="Times New Roman" w:cs="Times New Roman"/>
+                <w:kern w:val="0"/>
+                <w:lang w:eastAsia="tr-TR"/>
+                <w14:ligatures w14:val="none"/>
+              </w:rPr>
+            </w:pPr>
+            <w:r>
+              <w:rPr>
+                <w:rFonts w:ascii="Times New Roman" w:eastAsia="Times New Roman" w:hAnsi="Times New Roman" w:cs="Times New Roman"/>
+                <w:kern w:val="0"/>
+                <w:lang w:eastAsia="tr-TR"/>
+                <w14:ligatures w14:val="none"/>
+              </w:rPr>
+              <w:t xml:space="preserve">Project </w:t>
+            </w:r>
+            <w:proofErr w:type="spellStart"/>
+            <w:r>
+              <w:rPr>
+                <w:rFonts w:ascii="Times New Roman" w:eastAsia="Times New Roman" w:hAnsi="Times New Roman" w:cs="Times New Roman"/>
+                <w:kern w:val="0"/>
+                <w:lang w:eastAsia="tr-TR"/>
+                <w14:ligatures w14:val="none"/>
+              </w:rPr>
+              <w:t>Summary</w:t>
+            </w:r>
+            <w:proofErr w:type="spellEnd"/>
+          </w:p>
+        </w:tc>
+        <w:tc>
+          <w:tcPr>
+            <w:tcW w:w="4086" w:type="dxa"/>
+            <w:vAlign w:val="center"/>
+            <w:hideMark/>
+          </w:tcPr>
+          <w:p>
+            <w:pPr>
+              <w:spacing w:after="0" w:line="240" w:lineRule="auto"/>
+              <w:rPr>
+                <w:rFonts w:ascii="Times New Roman" w:eastAsia="Times New Roman" w:hAnsi="Times New Roman" w:cs="Times New Roman"/>
+                <w:kern w:val="0"/>
+                <w:lang w:eastAsia="tr-TR"/>
+                <w14:ligatures w14:val="none"/>
+              </w:rPr>
+            </w:pPr>
+            <w:r>
+              <w:rPr>
+                <w:rFonts w:ascii="Times New Roman" w:eastAsia="Times New Roman" w:hAnsi="Times New Roman" w:cs="Times New Roman"/>
+                <w:kern w:val="0"/>
+                <w:lang w:eastAsia="tr-TR"/>
+                <w14:ligatures w14:val="none"/>
+              </w:rPr>
+              <w:t xml:space="preserve">Oğuz Giray </w:t>
+            </w:r>
+            <w:proofErr w:type="spellStart"/>
+            <w:r>
+              <w:rPr>
+                <w:rFonts w:ascii="Times New Roman" w:eastAsia="Times New Roman" w:hAnsi="Times New Roman" w:cs="Times New Roman"/>
+                <w:kern w:val="0"/>
+                <w:lang w:eastAsia="tr-TR"/>
+                <w14:ligatures w14:val="none"/>
+              </w:rPr>
+              <w:t>Bori</w:t>
+            </w:r>
+            <w:proofErr w:type="spellEnd"/>
           </w:p>
         </w:tc>
       </w:tr>
       <w:tr>
         <w:trPr>
-          <w:trHeight w:val="634"/>
           <w:tblCellSpacing w:w="15" w:type="dxa"/>
         </w:trPr>
         <w:tc>
           <w:tcPr>
             <w:tcW w:w="0" w:type="auto"/>
-            <w:tcBorders>
-              <w:top w:val="single" w:sz="6" w:space="0" w:color="auto"/>
-              <w:left w:val="single" w:sz="6" w:space="0" w:color="auto"/>
-              <w:bottom w:val="single" w:sz="6" w:space="0" w:color="auto"/>
-              <w:right w:val="single" w:sz="6" w:space="0" w:color="auto"/>
-            </w:tcBorders>
-            <w:tcMar>
-              <w:top w:w="120" w:type="dxa"/>
-              <w:left w:w="180" w:type="dxa"/>
-              <w:bottom w:w="120" w:type="dxa"/>
-              <w:right w:w="180" w:type="dxa"/>
-            </w:tcMar>
-            <w:vAlign w:val="center"/>
-            <w:hideMark/>
-          </w:tcPr>
-          <w:p>
-            <w:pPr>
-              <w:jc w:val="center"/>
-              <w:rPr>
-                <w:b/>
-                <w:bCs/>
-                <w:color w:val="0F4761" w:themeColor="accent1" w:themeShade="BF"/>
-              </w:rPr>
-            </w:pPr>
-            <w:proofErr w:type="spellStart"/>
-            <w:r>
-              <w:rPr>
-                <w:b/>
-                <w:bCs/>
-                <w:color w:val="0F4761" w:themeColor="accent1" w:themeShade="BF"/>
-              </w:rPr>
-              <w:t>Effort</w:t>
-            </w:r>
-            <w:proofErr w:type="spellEnd"/>
-            <w:r>
-              <w:rPr>
-                <w:b/>
-                <w:bCs/>
-                <w:color w:val="0F4761" w:themeColor="accent1" w:themeShade="BF"/>
-              </w:rPr>
-              <w:t xml:space="preserve"> </w:t>
-            </w:r>
-            <w:proofErr w:type="spellStart"/>
-            <w:r>
-              <w:rPr>
-                <w:b/>
-                <w:bCs/>
-                <w:color w:val="0F4761" w:themeColor="accent1" w:themeShade="BF"/>
-              </w:rPr>
-              <w:t>Estimation</w:t>
-            </w:r>
-            <w:proofErr w:type="spellEnd"/>
-            <w:r>
-              <w:rPr>
-                <w:b/>
-                <w:bCs/>
-                <w:color w:val="0F4761" w:themeColor="accent1" w:themeShade="BF"/>
-              </w:rPr>
-              <w:t xml:space="preserve"> </w:t>
-            </w:r>
-            <w:proofErr w:type="spellStart"/>
-            <w:r>
-              <w:rPr>
-                <w:b/>
-                <w:bCs/>
-                <w:color w:val="0F4761" w:themeColor="accent1" w:themeShade="BF"/>
-              </w:rPr>
-              <w:t>Calculations</w:t>
-            </w:r>
-            <w:proofErr w:type="spellEnd"/>
-          </w:p>
-        </w:tc>
-        <w:tc>
-          <w:tcPr>
-            <w:tcW w:w="0" w:type="auto"/>
-            <w:tcBorders>
-              <w:top w:val="single" w:sz="6" w:space="0" w:color="auto"/>
-              <w:left w:val="single" w:sz="6" w:space="0" w:color="auto"/>
-              <w:bottom w:val="single" w:sz="6" w:space="0" w:color="auto"/>
-              <w:right w:val="single" w:sz="6" w:space="0" w:color="auto"/>
-            </w:tcBorders>
-            <w:tcMar>
-              <w:top w:w="120" w:type="dxa"/>
-              <w:left w:w="180" w:type="dxa"/>
-              <w:bottom w:w="120" w:type="dxa"/>
-              <w:right w:w="180" w:type="dxa"/>
-            </w:tcMar>
-            <w:vAlign w:val="center"/>
-            <w:hideMark/>
-          </w:tcPr>
-          <w:p>
-            <w:pPr>
-              <w:jc w:val="center"/>
-            </w:pPr>
-            <w:r>
-              <w:t xml:space="preserve">Oğuz Giray </w:t>
-            </w:r>
-            <w:proofErr w:type="spellStart"/>
-            <w:r>
-              <w:t>Bori</w:t>
-            </w:r>
-            <w:proofErr w:type="spellEnd"/>
+            <w:vAlign w:val="center"/>
+            <w:hideMark/>
+          </w:tcPr>
+          <w:p>
+            <w:pPr>
+              <w:spacing w:after="0" w:line="240" w:lineRule="auto"/>
+              <w:rPr>
+                <w:rFonts w:ascii="Times New Roman" w:eastAsia="Times New Roman" w:hAnsi="Times New Roman" w:cs="Times New Roman"/>
+                <w:kern w:val="0"/>
+                <w:lang w:eastAsia="tr-TR"/>
+                <w14:ligatures w14:val="none"/>
+              </w:rPr>
+            </w:pPr>
+            <w:proofErr w:type="spellStart"/>
+            <w:r>
+              <w:rPr>
+                <w:rFonts w:ascii="Times New Roman" w:eastAsia="Times New Roman" w:hAnsi="Times New Roman" w:cs="Times New Roman"/>
+                <w:kern w:val="0"/>
+                <w:lang w:eastAsia="tr-TR"/>
+                <w14:ligatures w14:val="none"/>
+              </w:rPr>
+              <w:t>Objectives</w:t>
+            </w:r>
+            <w:proofErr w:type="spellEnd"/>
+            <w:r>
+              <w:rPr>
+                <w:rFonts w:ascii="Times New Roman" w:eastAsia="Times New Roman" w:hAnsi="Times New Roman" w:cs="Times New Roman"/>
+                <w:kern w:val="0"/>
+                <w:lang w:eastAsia="tr-TR"/>
+                <w14:ligatures w14:val="none"/>
+              </w:rPr>
+              <w:t xml:space="preserve"> &amp; </w:t>
+            </w:r>
+            <w:proofErr w:type="spellStart"/>
+            <w:r>
+              <w:rPr>
+                <w:rFonts w:ascii="Times New Roman" w:eastAsia="Times New Roman" w:hAnsi="Times New Roman" w:cs="Times New Roman"/>
+                <w:kern w:val="0"/>
+                <w:lang w:eastAsia="tr-TR"/>
+                <w14:ligatures w14:val="none"/>
+              </w:rPr>
+              <w:t>Scope</w:t>
+            </w:r>
+            <w:proofErr w:type="spellEnd"/>
+            <w:r>
+              <w:rPr>
+                <w:rFonts w:ascii="Times New Roman" w:eastAsia="Times New Roman" w:hAnsi="Times New Roman" w:cs="Times New Roman"/>
+                <w:kern w:val="0"/>
+                <w:lang w:eastAsia="tr-TR"/>
+                <w14:ligatures w14:val="none"/>
+              </w:rPr>
+              <w:t xml:space="preserve"> Definition</w:t>
+            </w:r>
+          </w:p>
+        </w:tc>
+        <w:tc>
+          <w:tcPr>
+            <w:tcW w:w="4086" w:type="dxa"/>
+            <w:vAlign w:val="center"/>
+            <w:hideMark/>
+          </w:tcPr>
+          <w:p>
+            <w:pPr>
+              <w:spacing w:after="0" w:line="240" w:lineRule="auto"/>
+              <w:rPr>
+                <w:rFonts w:ascii="Times New Roman" w:eastAsia="Times New Roman" w:hAnsi="Times New Roman" w:cs="Times New Roman"/>
+                <w:kern w:val="0"/>
+                <w:lang w:eastAsia="tr-TR"/>
+                <w14:ligatures w14:val="none"/>
+              </w:rPr>
+            </w:pPr>
+            <w:r>
+              <w:rPr>
+                <w:rFonts w:ascii="Times New Roman" w:eastAsia="Times New Roman" w:hAnsi="Times New Roman" w:cs="Times New Roman"/>
+                <w:kern w:val="0"/>
+                <w:lang w:eastAsia="tr-TR"/>
+                <w14:ligatures w14:val="none"/>
+              </w:rPr>
+              <w:t>Deren Berk</w:t>
+            </w:r>
           </w:p>
         </w:tc>
       </w:tr>
       <w:tr>
         <w:trPr>
-          <w:trHeight w:val="634"/>
           <w:tblCellSpacing w:w="15" w:type="dxa"/>
         </w:trPr>
         <w:tc>
           <w:tcPr>
             <w:tcW w:w="0" w:type="auto"/>
-            <w:tcBorders>
-              <w:top w:val="single" w:sz="6" w:space="0" w:color="auto"/>
-              <w:left w:val="single" w:sz="6" w:space="0" w:color="auto"/>
-              <w:bottom w:val="single" w:sz="6" w:space="0" w:color="auto"/>
-              <w:right w:val="single" w:sz="6" w:space="0" w:color="auto"/>
-            </w:tcBorders>
-            <w:tcMar>
-              <w:top w:w="120" w:type="dxa"/>
-              <w:left w:w="180" w:type="dxa"/>
-              <w:bottom w:w="120" w:type="dxa"/>
-              <w:right w:w="180" w:type="dxa"/>
-            </w:tcMar>
-            <w:vAlign w:val="center"/>
-            <w:hideMark/>
-          </w:tcPr>
-          <w:p>
-            <w:pPr>
-              <w:jc w:val="center"/>
-              <w:rPr>
-                <w:b/>
-                <w:bCs/>
-                <w:color w:val="0F4761" w:themeColor="accent1" w:themeShade="BF"/>
-              </w:rPr>
-            </w:pPr>
-            <w:proofErr w:type="spellStart"/>
-            <w:r>
-              <w:rPr>
-                <w:b/>
-                <w:bCs/>
-                <w:color w:val="0F4761" w:themeColor="accent1" w:themeShade="BF"/>
-              </w:rPr>
-              <w:t>Task</w:t>
-            </w:r>
-            <w:proofErr w:type="spellEnd"/>
-            <w:r>
-              <w:rPr>
-                <w:b/>
-                <w:bCs/>
-                <w:color w:val="0F4761" w:themeColor="accent1" w:themeShade="BF"/>
-              </w:rPr>
-              <w:t xml:space="preserve"> </w:t>
-            </w:r>
-            <w:proofErr w:type="spellStart"/>
-            <w:r>
-              <w:rPr>
-                <w:b/>
-                <w:bCs/>
-                <w:color w:val="0F4761" w:themeColor="accent1" w:themeShade="BF"/>
-              </w:rPr>
-              <w:t>Assignment</w:t>
-            </w:r>
-            <w:proofErr w:type="spellEnd"/>
-            <w:r>
-              <w:rPr>
-                <w:b/>
-                <w:bCs/>
-                <w:color w:val="0F4761" w:themeColor="accent1" w:themeShade="BF"/>
+            <w:vAlign w:val="center"/>
+            <w:hideMark/>
+          </w:tcPr>
+          <w:p>
+            <w:pPr>
+              <w:spacing w:after="0" w:line="240" w:lineRule="auto"/>
+              <w:rPr>
+                <w:rFonts w:ascii="Times New Roman" w:eastAsia="Times New Roman" w:hAnsi="Times New Roman" w:cs="Times New Roman"/>
+                <w:kern w:val="0"/>
+                <w:lang w:eastAsia="tr-TR"/>
+                <w14:ligatures w14:val="none"/>
+              </w:rPr>
+            </w:pPr>
+            <w:proofErr w:type="spellStart"/>
+            <w:r>
+              <w:rPr>
+                <w:rFonts w:ascii="Times New Roman" w:eastAsia="Times New Roman" w:hAnsi="Times New Roman" w:cs="Times New Roman"/>
+                <w:kern w:val="0"/>
+                <w:lang w:eastAsia="tr-TR"/>
+                <w14:ligatures w14:val="none"/>
+              </w:rPr>
+              <w:t>Key</w:t>
+            </w:r>
+            <w:proofErr w:type="spellEnd"/>
+            <w:r>
+              <w:rPr>
+                <w:rFonts w:ascii="Times New Roman" w:eastAsia="Times New Roman" w:hAnsi="Times New Roman" w:cs="Times New Roman"/>
+                <w:kern w:val="0"/>
+                <w:lang w:eastAsia="tr-TR"/>
+                <w14:ligatures w14:val="none"/>
+              </w:rPr>
+              <w:t xml:space="preserve"> </w:t>
+            </w:r>
+            <w:proofErr w:type="spellStart"/>
+            <w:r>
+              <w:rPr>
+                <w:rFonts w:ascii="Times New Roman" w:eastAsia="Times New Roman" w:hAnsi="Times New Roman" w:cs="Times New Roman"/>
+                <w:kern w:val="0"/>
+                <w:lang w:eastAsia="tr-TR"/>
+                <w14:ligatures w14:val="none"/>
+              </w:rPr>
+              <w:t>Features</w:t>
+            </w:r>
+            <w:proofErr w:type="spellEnd"/>
+            <w:r>
+              <w:rPr>
+                <w:rFonts w:ascii="Times New Roman" w:eastAsia="Times New Roman" w:hAnsi="Times New Roman" w:cs="Times New Roman"/>
+                <w:kern w:val="0"/>
+                <w:lang w:eastAsia="tr-TR"/>
+                <w14:ligatures w14:val="none"/>
               </w:rPr>
               <w:t xml:space="preserve"> &amp; </w:t>
             </w:r>
             <w:proofErr w:type="spellStart"/>
             <w:r>
               <w:rPr>
-                <w:b/>
-                <w:bCs/>
-                <w:color w:val="0F4761" w:themeColor="accent1" w:themeShade="BF"/>
-              </w:rPr>
-              <w:t>Rationale</w:t>
-            </w:r>
-            <w:proofErr w:type="spellEnd"/>
-          </w:p>
-        </w:tc>
-        <w:tc>
-          <w:tcPr>
-            <w:tcW w:w="0" w:type="auto"/>
-            <w:tcBorders>
-              <w:top w:val="single" w:sz="6" w:space="0" w:color="auto"/>
-              <w:left w:val="single" w:sz="6" w:space="0" w:color="auto"/>
-              <w:bottom w:val="single" w:sz="6" w:space="0" w:color="auto"/>
-              <w:right w:val="single" w:sz="6" w:space="0" w:color="auto"/>
-            </w:tcBorders>
-            <w:tcMar>
-              <w:top w:w="120" w:type="dxa"/>
-              <w:left w:w="180" w:type="dxa"/>
-              <w:bottom w:w="120" w:type="dxa"/>
-              <w:right w:w="180" w:type="dxa"/>
-            </w:tcMar>
-            <w:vAlign w:val="center"/>
-            <w:hideMark/>
-          </w:tcPr>
-          <w:p>
-            <w:pPr>
-              <w:jc w:val="center"/>
-            </w:pPr>
-            <w:proofErr w:type="spellStart"/>
-            <w:r>
-              <w:t>Şevda</w:t>
-            </w:r>
-            <w:proofErr w:type="spellEnd"/>
-            <w:r>
-              <w:t xml:space="preserve"> Yağmur Asal</w:t>
+                <w:rFonts w:ascii="Times New Roman" w:eastAsia="Times New Roman" w:hAnsi="Times New Roman" w:cs="Times New Roman"/>
+                <w:kern w:val="0"/>
+                <w:lang w:eastAsia="tr-TR"/>
+                <w14:ligatures w14:val="none"/>
+              </w:rPr>
+              <w:t>Target</w:t>
+            </w:r>
+            <w:proofErr w:type="spellEnd"/>
+            <w:r>
+              <w:rPr>
+                <w:rFonts w:ascii="Times New Roman" w:eastAsia="Times New Roman" w:hAnsi="Times New Roman" w:cs="Times New Roman"/>
+                <w:kern w:val="0"/>
+                <w:lang w:eastAsia="tr-TR"/>
+                <w14:ligatures w14:val="none"/>
+              </w:rPr>
+              <w:t xml:space="preserve"> </w:t>
+            </w:r>
+            <w:proofErr w:type="spellStart"/>
+            <w:r>
+              <w:rPr>
+                <w:rFonts w:ascii="Times New Roman" w:eastAsia="Times New Roman" w:hAnsi="Times New Roman" w:cs="Times New Roman"/>
+                <w:kern w:val="0"/>
+                <w:lang w:eastAsia="tr-TR"/>
+                <w14:ligatures w14:val="none"/>
+              </w:rPr>
+              <w:t>Audience</w:t>
+            </w:r>
+            <w:proofErr w:type="spellEnd"/>
+          </w:p>
+        </w:tc>
+        <w:tc>
+          <w:tcPr>
+            <w:tcW w:w="4086" w:type="dxa"/>
+            <w:vAlign w:val="center"/>
+            <w:hideMark/>
+          </w:tcPr>
+          <w:p>
+            <w:pPr>
+              <w:spacing w:after="0" w:line="240" w:lineRule="auto"/>
+              <w:rPr>
+                <w:rFonts w:ascii="Times New Roman" w:eastAsia="Times New Roman" w:hAnsi="Times New Roman" w:cs="Times New Roman"/>
+                <w:kern w:val="0"/>
+                <w:lang w:eastAsia="tr-TR"/>
+                <w14:ligatures w14:val="none"/>
+              </w:rPr>
+            </w:pPr>
+            <w:r>
+              <w:rPr>
+                <w:rFonts w:ascii="Times New Roman" w:eastAsia="Times New Roman" w:hAnsi="Times New Roman" w:cs="Times New Roman"/>
+                <w:kern w:val="0"/>
+                <w:lang w:eastAsia="tr-TR"/>
+                <w14:ligatures w14:val="none"/>
+              </w:rPr>
+              <w:t>Mert Donmez</w:t>
             </w:r>
           </w:p>
         </w:tc>
       </w:tr>
       <w:tr>
         <w:trPr>
-          <w:trHeight w:val="360"/>
           <w:tblCellSpacing w:w="15" w:type="dxa"/>
         </w:trPr>
         <w:tc>
           <w:tcPr>
             <w:tcW w:w="0" w:type="auto"/>
-            <w:tcBorders>
-              <w:top w:val="single" w:sz="6" w:space="0" w:color="auto"/>
-              <w:left w:val="single" w:sz="6" w:space="0" w:color="auto"/>
-              <w:bottom w:val="single" w:sz="6" w:space="0" w:color="auto"/>
-              <w:right w:val="single" w:sz="6" w:space="0" w:color="auto"/>
-            </w:tcBorders>
-            <w:tcMar>
-              <w:top w:w="120" w:type="dxa"/>
-              <w:left w:w="180" w:type="dxa"/>
-              <w:bottom w:w="120" w:type="dxa"/>
-              <w:right w:w="180" w:type="dxa"/>
-            </w:tcMar>
-            <w:vAlign w:val="center"/>
-            <w:hideMark/>
-          </w:tcPr>
-          <w:p>
-            <w:pPr>
-              <w:jc w:val="center"/>
-              <w:rPr>
-                <w:b/>
-                <w:bCs/>
-                <w:color w:val="0F4761" w:themeColor="accent1" w:themeShade="BF"/>
-              </w:rPr>
-            </w:pPr>
-            <w:r>
-              <w:rPr>
-                <w:b/>
-                <w:bCs/>
-                <w:color w:val="0F4761" w:themeColor="accent1" w:themeShade="BF"/>
+            <w:vAlign w:val="center"/>
+            <w:hideMark/>
+          </w:tcPr>
+          <w:p>
+            <w:pPr>
+              <w:spacing w:after="0" w:line="240" w:lineRule="auto"/>
+              <w:rPr>
+                <w:rFonts w:ascii="Times New Roman" w:eastAsia="Times New Roman" w:hAnsi="Times New Roman" w:cs="Times New Roman"/>
+                <w:kern w:val="0"/>
+                <w:lang w:eastAsia="tr-TR"/>
+                <w14:ligatures w14:val="none"/>
+              </w:rPr>
+            </w:pPr>
+            <w:proofErr w:type="spellStart"/>
+            <w:r>
+              <w:rPr>
+                <w:rFonts w:ascii="Times New Roman" w:eastAsia="Times New Roman" w:hAnsi="Times New Roman" w:cs="Times New Roman"/>
+                <w:kern w:val="0"/>
+                <w:lang w:eastAsia="tr-TR"/>
+                <w14:ligatures w14:val="none"/>
+              </w:rPr>
+              <w:t>Risks</w:t>
+            </w:r>
+            <w:proofErr w:type="spellEnd"/>
+            <w:r>
+              <w:rPr>
+                <w:rFonts w:ascii="Times New Roman" w:eastAsia="Times New Roman" w:hAnsi="Times New Roman" w:cs="Times New Roman"/>
+                <w:kern w:val="0"/>
+                <w:lang w:eastAsia="tr-TR"/>
+                <w14:ligatures w14:val="none"/>
+              </w:rPr>
+              <w:t xml:space="preserve"> </w:t>
+            </w:r>
+            <w:proofErr w:type="spellStart"/>
+            <w:r>
+              <w:rPr>
+                <w:rFonts w:ascii="Times New Roman" w:eastAsia="Times New Roman" w:hAnsi="Times New Roman" w:cs="Times New Roman"/>
+                <w:kern w:val="0"/>
+                <w:lang w:eastAsia="tr-TR"/>
+                <w14:ligatures w14:val="none"/>
+              </w:rPr>
+              <w:t>and</w:t>
+            </w:r>
+            <w:proofErr w:type="spellEnd"/>
+            <w:r>
+              <w:rPr>
+                <w:rFonts w:ascii="Times New Roman" w:eastAsia="Times New Roman" w:hAnsi="Times New Roman" w:cs="Times New Roman"/>
+                <w:kern w:val="0"/>
+                <w:lang w:eastAsia="tr-TR"/>
+                <w14:ligatures w14:val="none"/>
+              </w:rPr>
+              <w:t xml:space="preserve"> </w:t>
+            </w:r>
+            <w:proofErr w:type="spellStart"/>
+            <w:r>
+              <w:rPr>
+                <w:rFonts w:ascii="Times New Roman" w:eastAsia="Times New Roman" w:hAnsi="Times New Roman" w:cs="Times New Roman"/>
+                <w:kern w:val="0"/>
+                <w:lang w:eastAsia="tr-TR"/>
+                <w14:ligatures w14:val="none"/>
+              </w:rPr>
+              <w:t>Mitigation</w:t>
+            </w:r>
+            <w:proofErr w:type="spellEnd"/>
+            <w:r>
+              <w:rPr>
+                <w:rFonts w:ascii="Times New Roman" w:eastAsia="Times New Roman" w:hAnsi="Times New Roman" w:cs="Times New Roman"/>
+                <w:kern w:val="0"/>
+                <w:lang w:eastAsia="tr-TR"/>
+                <w14:ligatures w14:val="none"/>
+              </w:rPr>
+              <w:t xml:space="preserve"> </w:t>
+            </w:r>
+            <w:proofErr w:type="spellStart"/>
+            <w:r>
+              <w:rPr>
+                <w:rFonts w:ascii="Times New Roman" w:eastAsia="Times New Roman" w:hAnsi="Times New Roman" w:cs="Times New Roman"/>
+                <w:kern w:val="0"/>
+                <w:lang w:eastAsia="tr-TR"/>
+                <w14:ligatures w14:val="none"/>
+              </w:rPr>
+              <w:t>Strategies</w:t>
+            </w:r>
+            <w:proofErr w:type="spellEnd"/>
+          </w:p>
+        </w:tc>
+        <w:tc>
+          <w:tcPr>
+            <w:tcW w:w="4086" w:type="dxa"/>
+            <w:vAlign w:val="center"/>
+            <w:hideMark/>
+          </w:tcPr>
+          <w:p>
+            <w:pPr>
+              <w:spacing w:after="0" w:line="240" w:lineRule="auto"/>
+              <w:rPr>
+                <w:rFonts w:ascii="Times New Roman" w:eastAsia="Times New Roman" w:hAnsi="Times New Roman" w:cs="Times New Roman"/>
+                <w:kern w:val="0"/>
+                <w:lang w:eastAsia="tr-TR"/>
+                <w14:ligatures w14:val="none"/>
+              </w:rPr>
+            </w:pPr>
+            <w:proofErr w:type="spellStart"/>
+            <w:r>
+              <w:rPr>
+                <w:rFonts w:ascii="Times New Roman" w:eastAsia="Times New Roman" w:hAnsi="Times New Roman" w:cs="Times New Roman"/>
+                <w:kern w:val="0"/>
+                <w:lang w:eastAsia="tr-TR"/>
+                <w14:ligatures w14:val="none"/>
+              </w:rPr>
+              <w:t>Şevda</w:t>
+            </w:r>
+            <w:proofErr w:type="spellEnd"/>
+            <w:r>
+              <w:rPr>
+                <w:rFonts w:ascii="Times New Roman" w:eastAsia="Times New Roman" w:hAnsi="Times New Roman" w:cs="Times New Roman"/>
+                <w:kern w:val="0"/>
+                <w:lang w:eastAsia="tr-TR"/>
+                <w14:ligatures w14:val="none"/>
+              </w:rPr>
+              <w:t xml:space="preserve"> Yağmur Asal</w:t>
+            </w:r>
+          </w:p>
+        </w:tc>
+      </w:tr>
+      <w:tr>
+        <w:trPr>
+          <w:tblCellSpacing w:w="15" w:type="dxa"/>
+        </w:trPr>
+        <w:tc>
+          <w:tcPr>
+            <w:tcW w:w="0" w:type="auto"/>
+            <w:vAlign w:val="center"/>
+            <w:hideMark/>
+          </w:tcPr>
+          <w:p>
+            <w:pPr>
+              <w:spacing w:after="0" w:line="240" w:lineRule="auto"/>
+              <w:rPr>
+                <w:rFonts w:ascii="Times New Roman" w:eastAsia="Times New Roman" w:hAnsi="Times New Roman" w:cs="Times New Roman"/>
+                <w:kern w:val="0"/>
+                <w:lang w:eastAsia="tr-TR"/>
+                <w14:ligatures w14:val="none"/>
+              </w:rPr>
+            </w:pPr>
+            <w:r>
+              <w:rPr>
+                <w:rFonts w:ascii="Times New Roman" w:eastAsia="Times New Roman" w:hAnsi="Times New Roman" w:cs="Times New Roman"/>
+                <w:kern w:val="0"/>
+                <w:lang w:eastAsia="tr-TR"/>
+                <w14:ligatures w14:val="none"/>
+              </w:rPr>
+              <w:t xml:space="preserve">Budget </w:t>
+            </w:r>
+            <w:proofErr w:type="spellStart"/>
+            <w:r>
+              <w:rPr>
+                <w:rFonts w:ascii="Times New Roman" w:eastAsia="Times New Roman" w:hAnsi="Times New Roman" w:cs="Times New Roman"/>
+                <w:kern w:val="0"/>
+                <w:lang w:eastAsia="tr-TR"/>
+                <w14:ligatures w14:val="none"/>
+              </w:rPr>
+              <w:t>and</w:t>
+            </w:r>
+            <w:proofErr w:type="spellEnd"/>
+            <w:r>
+              <w:rPr>
+                <w:rFonts w:ascii="Times New Roman" w:eastAsia="Times New Roman" w:hAnsi="Times New Roman" w:cs="Times New Roman"/>
+                <w:kern w:val="0"/>
+                <w:lang w:eastAsia="tr-TR"/>
+                <w14:ligatures w14:val="none"/>
+              </w:rPr>
+              <w:t xml:space="preserve"> </w:t>
+            </w:r>
+            <w:proofErr w:type="spellStart"/>
+            <w:r>
+              <w:rPr>
+                <w:rFonts w:ascii="Times New Roman" w:eastAsia="Times New Roman" w:hAnsi="Times New Roman" w:cs="Times New Roman"/>
+                <w:kern w:val="0"/>
+                <w:lang w:eastAsia="tr-TR"/>
+                <w14:ligatures w14:val="none"/>
+              </w:rPr>
+              <w:t>Resources</w:t>
+            </w:r>
+            <w:proofErr w:type="spellEnd"/>
+          </w:p>
+        </w:tc>
+        <w:tc>
+          <w:tcPr>
+            <w:tcW w:w="4086" w:type="dxa"/>
+            <w:vAlign w:val="center"/>
+            <w:hideMark/>
+          </w:tcPr>
+          <w:p>
+            <w:pPr>
+              <w:spacing w:after="0" w:line="240" w:lineRule="auto"/>
+              <w:rPr>
+                <w:rFonts w:ascii="Times New Roman" w:eastAsia="Times New Roman" w:hAnsi="Times New Roman" w:cs="Times New Roman"/>
+                <w:kern w:val="0"/>
+                <w:lang w:eastAsia="tr-TR"/>
+                <w14:ligatures w14:val="none"/>
+              </w:rPr>
+            </w:pPr>
+            <w:r>
+              <w:rPr>
+                <w:rFonts w:ascii="Times New Roman" w:eastAsia="Times New Roman" w:hAnsi="Times New Roman" w:cs="Times New Roman"/>
+                <w:kern w:val="0"/>
+                <w:lang w:eastAsia="tr-TR"/>
+                <w14:ligatures w14:val="none"/>
+              </w:rPr>
+              <w:t xml:space="preserve">Oğuz Giray </w:t>
+            </w:r>
+            <w:proofErr w:type="spellStart"/>
+            <w:r>
+              <w:rPr>
+                <w:rFonts w:ascii="Times New Roman" w:eastAsia="Times New Roman" w:hAnsi="Times New Roman" w:cs="Times New Roman"/>
+                <w:kern w:val="0"/>
+                <w:lang w:eastAsia="tr-TR"/>
+                <w14:ligatures w14:val="none"/>
+              </w:rPr>
+              <w:t>Bori</w:t>
+            </w:r>
+            <w:proofErr w:type="spellEnd"/>
+          </w:p>
+        </w:tc>
+      </w:tr>
+      <w:tr>
+        <w:trPr>
+          <w:tblCellSpacing w:w="15" w:type="dxa"/>
+        </w:trPr>
+        <w:tc>
+          <w:tcPr>
+            <w:tcW w:w="0" w:type="auto"/>
+            <w:vAlign w:val="center"/>
+            <w:hideMark/>
+          </w:tcPr>
+          <w:p>
+            <w:pPr>
+              <w:spacing w:after="0" w:line="240" w:lineRule="auto"/>
+              <w:rPr>
+                <w:rFonts w:ascii="Times New Roman" w:eastAsia="Times New Roman" w:hAnsi="Times New Roman" w:cs="Times New Roman"/>
+                <w:kern w:val="0"/>
+                <w:lang w:eastAsia="tr-TR"/>
+                <w14:ligatures w14:val="none"/>
+              </w:rPr>
+            </w:pPr>
+            <w:r>
+              <w:rPr>
+                <w:rFonts w:ascii="Times New Roman" w:eastAsia="Times New Roman" w:hAnsi="Times New Roman" w:cs="Times New Roman"/>
+                <w:kern w:val="0"/>
+                <w:lang w:eastAsia="tr-TR"/>
+                <w14:ligatures w14:val="none"/>
+              </w:rPr>
+              <w:t xml:space="preserve">Project </w:t>
+            </w:r>
+            <w:proofErr w:type="spellStart"/>
+            <w:r>
+              <w:rPr>
+                <w:rFonts w:ascii="Times New Roman" w:eastAsia="Times New Roman" w:hAnsi="Times New Roman" w:cs="Times New Roman"/>
+                <w:kern w:val="0"/>
+                <w:lang w:eastAsia="tr-TR"/>
+                <w14:ligatures w14:val="none"/>
+              </w:rPr>
+              <w:t>Success</w:t>
+            </w:r>
+            <w:proofErr w:type="spellEnd"/>
+            <w:r>
+              <w:rPr>
+                <w:rFonts w:ascii="Times New Roman" w:eastAsia="Times New Roman" w:hAnsi="Times New Roman" w:cs="Times New Roman"/>
+                <w:kern w:val="0"/>
+                <w:lang w:eastAsia="tr-TR"/>
+                <w14:ligatures w14:val="none"/>
+              </w:rPr>
+              <w:t xml:space="preserve"> </w:t>
+            </w:r>
+            <w:proofErr w:type="spellStart"/>
+            <w:r>
+              <w:rPr>
+                <w:rFonts w:ascii="Times New Roman" w:eastAsia="Times New Roman" w:hAnsi="Times New Roman" w:cs="Times New Roman"/>
+                <w:kern w:val="0"/>
+                <w:lang w:eastAsia="tr-TR"/>
+                <w14:ligatures w14:val="none"/>
+              </w:rPr>
+              <w:t>Criteria</w:t>
+            </w:r>
+            <w:proofErr w:type="spellEnd"/>
+          </w:p>
+        </w:tc>
+        <w:tc>
+          <w:tcPr>
+            <w:tcW w:w="4086" w:type="dxa"/>
+            <w:vAlign w:val="center"/>
+            <w:hideMark/>
+          </w:tcPr>
+          <w:p>
+            <w:pPr>
+              <w:spacing w:after="0" w:line="240" w:lineRule="auto"/>
+              <w:rPr>
+                <w:rFonts w:ascii="Times New Roman" w:eastAsia="Times New Roman" w:hAnsi="Times New Roman" w:cs="Times New Roman"/>
+                <w:kern w:val="0"/>
+                <w:lang w:eastAsia="tr-TR"/>
+                <w14:ligatures w14:val="none"/>
+              </w:rPr>
+            </w:pPr>
+            <w:r>
+              <w:rPr>
+                <w:rFonts w:ascii="Times New Roman" w:eastAsia="Times New Roman" w:hAnsi="Times New Roman" w:cs="Times New Roman"/>
+                <w:kern w:val="0"/>
+                <w:lang w:eastAsia="tr-TR"/>
+                <w14:ligatures w14:val="none"/>
+              </w:rPr>
+              <w:t>Deren Berk</w:t>
+            </w:r>
+          </w:p>
+        </w:tc>
+      </w:tr>
+      <w:tr>
+        <w:trPr>
+          <w:trHeight w:val="545"/>
+          <w:tblCellSpacing w:w="15" w:type="dxa"/>
+        </w:trPr>
+        <w:tc>
+          <w:tcPr>
+            <w:tcW w:w="0" w:type="auto"/>
+            <w:vAlign w:val="center"/>
+            <w:hideMark/>
+          </w:tcPr>
+          <w:p>
+            <w:pPr>
+              <w:spacing w:after="0" w:line="240" w:lineRule="auto"/>
+              <w:rPr>
+                <w:rFonts w:ascii="Times New Roman" w:eastAsia="Times New Roman" w:hAnsi="Times New Roman" w:cs="Times New Roman"/>
+                <w:kern w:val="0"/>
+                <w:lang w:eastAsia="tr-TR"/>
+                <w14:ligatures w14:val="none"/>
+              </w:rPr>
+            </w:pPr>
+            <w:r>
+              <w:rPr>
+                <w:rFonts w:ascii="Times New Roman" w:eastAsia="Times New Roman" w:hAnsi="Times New Roman" w:cs="Times New Roman"/>
+                <w:kern w:val="0"/>
+                <w:lang w:eastAsia="tr-TR"/>
+                <w14:ligatures w14:val="none"/>
               </w:rPr>
               <w:t xml:space="preserve">Final </w:t>
             </w:r>
             <w:proofErr w:type="spellStart"/>
             <w:r>
               <w:rPr>
-                <w:b/>
-                <w:bCs/>
-                <w:color w:val="0F4761" w:themeColor="accent1" w:themeShade="BF"/>
+                <w:rFonts w:ascii="Times New Roman" w:eastAsia="Times New Roman" w:hAnsi="Times New Roman" w:cs="Times New Roman"/>
+                <w:kern w:val="0"/>
+                <w:lang w:eastAsia="tr-TR"/>
+                <w14:ligatures w14:val="none"/>
               </w:rPr>
               <w:t>Review</w:t>
             </w:r>
             <w:proofErr w:type="spellEnd"/>
             <w:r>
               <w:rPr>
-                <w:b/>
-                <w:bCs/>
-                <w:color w:val="0F4761" w:themeColor="accent1" w:themeShade="BF"/>
-              </w:rPr>
-              <w:t xml:space="preserve"> &amp; </w:t>
-            </w:r>
-            <w:proofErr w:type="spellStart"/>
-            <w:r>
-              <w:rPr>
-                <w:b/>
-                <w:bCs/>
-                <w:color w:val="0F4761" w:themeColor="accent1" w:themeShade="BF"/>
-              </w:rPr>
-              <w:t>Formatting</w:t>
-            </w:r>
-            <w:proofErr w:type="spellEnd"/>
-          </w:p>
-        </w:tc>
-        <w:tc>
-          <w:tcPr>
-            <w:tcW w:w="0" w:type="auto"/>
-            <w:tcBorders>
-              <w:top w:val="single" w:sz="6" w:space="0" w:color="auto"/>
-              <w:left w:val="single" w:sz="6" w:space="0" w:color="auto"/>
-              <w:bottom w:val="single" w:sz="6" w:space="0" w:color="auto"/>
-              <w:right w:val="single" w:sz="6" w:space="0" w:color="auto"/>
-            </w:tcBorders>
-            <w:tcMar>
-              <w:top w:w="120" w:type="dxa"/>
-              <w:left w:w="180" w:type="dxa"/>
-              <w:bottom w:w="120" w:type="dxa"/>
-              <w:right w:w="180" w:type="dxa"/>
-            </w:tcMar>
-            <w:vAlign w:val="center"/>
-            <w:hideMark/>
-          </w:tcPr>
-          <w:p>
-            <w:pPr>
-              <w:jc w:val="center"/>
-            </w:pPr>
-            <w:r>
-              <w:t>Deren Berk</w:t>
+                <w:rFonts w:ascii="Times New Roman" w:eastAsia="Times New Roman" w:hAnsi="Times New Roman" w:cs="Times New Roman"/>
+                <w:kern w:val="0"/>
+                <w:lang w:eastAsia="tr-TR"/>
+                <w14:ligatures w14:val="none"/>
+              </w:rPr>
+              <w:t xml:space="preserve"> &amp; Editing</w:t>
+            </w:r>
+          </w:p>
+        </w:tc>
+        <w:tc>
+          <w:tcPr>
+            <w:tcW w:w="4086" w:type="dxa"/>
+            <w:vAlign w:val="center"/>
+            <w:hideMark/>
+          </w:tcPr>
+          <w:p>
+            <w:pPr>
+              <w:spacing w:after="0" w:line="240" w:lineRule="auto"/>
+              <w:rPr>
+                <w:rFonts w:ascii="Times New Roman" w:eastAsia="Times New Roman" w:hAnsi="Times New Roman" w:cs="Times New Roman"/>
+                <w:kern w:val="0"/>
+                <w:lang w:eastAsia="tr-TR"/>
+                <w14:ligatures w14:val="none"/>
+              </w:rPr>
+            </w:pPr>
+            <w:r>
+              <w:rPr>
+                <w:rFonts w:ascii="Times New Roman" w:eastAsia="Times New Roman" w:hAnsi="Times New Roman" w:cs="Times New Roman"/>
+                <w:kern w:val="0"/>
+                <w:lang w:eastAsia="tr-TR"/>
+                <w14:ligatures w14:val="none"/>
+              </w:rPr>
+              <w:t>Tüm Ekip</w:t>
             </w:r>
           </w:p>
         </w:tc>
@@ -14208,11 +14457,11 @@
     <w:qFormat/>
     <w:rsid w:val="00B72D8C"/>
   </w:style>
-  <w:style w:type="paragraph" w:styleId="Heading1">
+  <w:style w:type="paragraph" w:styleId="Balk1">
     <w:name w:val="heading 1"/>
     <w:basedOn w:val="Normal"/>
     <w:next w:val="Normal"/>
-    <w:link w:val="Heading1Char"/>
+    <w:link w:val="Balk1Char"/>
     <w:uiPriority w:val="9"/>
     <w:qFormat/>
     <w:rsid w:val="00DB004E"/>
@@ -14229,11 +14478,11 @@
       <w:szCs w:val="40"/>
     </w:rPr>
   </w:style>
-  <w:style w:type="paragraph" w:styleId="Heading2">
+  <w:style w:type="paragraph" w:styleId="Balk2">
     <w:name w:val="heading 2"/>
     <w:basedOn w:val="Normal"/>
     <w:next w:val="Normal"/>
-    <w:link w:val="Heading2Char"/>
+    <w:link w:val="Balk2Char"/>
     <w:uiPriority w:val="9"/>
     <w:semiHidden/>
     <w:unhideWhenUsed/>
@@ -14252,11 +14501,11 @@
       <w:szCs w:val="32"/>
     </w:rPr>
   </w:style>
-  <w:style w:type="paragraph" w:styleId="Heading3">
+  <w:style w:type="paragraph" w:styleId="Balk3">
     <w:name w:val="heading 3"/>
     <w:basedOn w:val="Normal"/>
     <w:next w:val="Normal"/>
-    <w:link w:val="Heading3Char"/>
+    <w:link w:val="Balk3Char"/>
     <w:uiPriority w:val="9"/>
     <w:semiHidden/>
     <w:unhideWhenUsed/>
@@ -14275,11 +14524,11 @@
       <w:szCs w:val="28"/>
     </w:rPr>
   </w:style>
-  <w:style w:type="paragraph" w:styleId="Heading4">
+  <w:style w:type="paragraph" w:styleId="Balk4">
     <w:name w:val="heading 4"/>
     <w:basedOn w:val="Normal"/>
     <w:next w:val="Normal"/>
-    <w:link w:val="Heading4Char"/>
+    <w:link w:val="Balk4Char"/>
     <w:uiPriority w:val="9"/>
     <w:semiHidden/>
     <w:unhideWhenUsed/>
@@ -14298,11 +14547,11 @@
       <w:color w:val="0F4761" w:themeColor="accent1" w:themeShade="BF"/>
     </w:rPr>
   </w:style>
-  <w:style w:type="paragraph" w:styleId="Heading5">
+  <w:style w:type="paragraph" w:styleId="Balk5">
     <w:name w:val="heading 5"/>
     <w:basedOn w:val="Normal"/>
     <w:next w:val="Normal"/>
-    <w:link w:val="Heading5Char"/>
+    <w:link w:val="Balk5Char"/>
     <w:uiPriority w:val="9"/>
     <w:semiHidden/>
     <w:unhideWhenUsed/>
@@ -14319,11 +14568,11 @@
       <w:color w:val="0F4761" w:themeColor="accent1" w:themeShade="BF"/>
     </w:rPr>
   </w:style>
-  <w:style w:type="paragraph" w:styleId="Heading6">
+  <w:style w:type="paragraph" w:styleId="Balk6">
     <w:name w:val="heading 6"/>
     <w:basedOn w:val="Normal"/>
     <w:next w:val="Normal"/>
-    <w:link w:val="Heading6Char"/>
+    <w:link w:val="Balk6Char"/>
     <w:uiPriority w:val="9"/>
     <w:semiHidden/>
     <w:unhideWhenUsed/>
@@ -14342,11 +14591,11 @@
       <w:color w:val="595959" w:themeColor="text1" w:themeTint="A6"/>
     </w:rPr>
   </w:style>
-  <w:style w:type="paragraph" w:styleId="Heading7">
+  <w:style w:type="paragraph" w:styleId="Balk7">
     <w:name w:val="heading 7"/>
     <w:basedOn w:val="Normal"/>
     <w:next w:val="Normal"/>
-    <w:link w:val="Heading7Char"/>
+    <w:link w:val="Balk7Char"/>
     <w:uiPriority w:val="9"/>
     <w:semiHidden/>
     <w:unhideWhenUsed/>
@@ -14363,11 +14612,11 @@
       <w:color w:val="595959" w:themeColor="text1" w:themeTint="A6"/>
     </w:rPr>
   </w:style>
-  <w:style w:type="paragraph" w:styleId="Heading8">
+  <w:style w:type="paragraph" w:styleId="Balk8">
     <w:name w:val="heading 8"/>
     <w:basedOn w:val="Normal"/>
     <w:next w:val="Normal"/>
-    <w:link w:val="Heading8Char"/>
+    <w:link w:val="Balk8Char"/>
     <w:uiPriority w:val="9"/>
     <w:semiHidden/>
     <w:unhideWhenUsed/>
@@ -14386,11 +14635,11 @@
       <w:color w:val="272727" w:themeColor="text1" w:themeTint="D8"/>
     </w:rPr>
   </w:style>
-  <w:style w:type="paragraph" w:styleId="Heading9">
+  <w:style w:type="paragraph" w:styleId="Balk9">
     <w:name w:val="heading 9"/>
     <w:basedOn w:val="Normal"/>
     <w:next w:val="Normal"/>
-    <w:link w:val="Heading9Char"/>
+    <w:link w:val="Balk9Char"/>
     <w:uiPriority w:val="9"/>
     <w:semiHidden/>
     <w:unhideWhenUsed/>
@@ -14407,12 +14656,13 @@
       <w:color w:val="272727" w:themeColor="text1" w:themeTint="D8"/>
     </w:rPr>
   </w:style>
-  <w:style w:type="character" w:default="1" w:styleId="DefaultParagraphFont">
+  <w:style w:type="character" w:default="1" w:styleId="VarsaylanParagrafYazTipi">
     <w:name w:val="Default Paragraph Font"/>
     <w:uiPriority w:val="1"/>
+    <w:semiHidden/>
     <w:unhideWhenUsed/>
   </w:style>
-  <w:style w:type="table" w:default="1" w:styleId="TableNormal">
+  <w:style w:type="table" w:default="1" w:styleId="NormalTablo">
     <w:name w:val="Normal Table"/>
     <w:uiPriority w:val="99"/>
     <w:semiHidden/>
@@ -14427,16 +14677,16 @@
       </w:tblCellMar>
     </w:tblPr>
   </w:style>
-  <w:style w:type="numbering" w:default="1" w:styleId="NoList">
+  <w:style w:type="numbering" w:default="1" w:styleId="ListeYok">
     <w:name w:val="No List"/>
     <w:uiPriority w:val="99"/>
     <w:semiHidden/>
     <w:unhideWhenUsed/>
   </w:style>
-  <w:style w:type="character" w:customStyle="1" w:styleId="Heading1Char">
-    <w:name w:val="Heading 1 Char"/>
-    <w:basedOn w:val="DefaultParagraphFont"/>
-    <w:link w:val="Heading1"/>
+  <w:style w:type="character" w:customStyle="1" w:styleId="Balk1Char">
+    <w:name w:val="Başlık 1 Char"/>
+    <w:basedOn w:val="VarsaylanParagrafYazTipi"/>
+    <w:link w:val="Balk1"/>
     <w:uiPriority w:val="9"/>
     <w:rsid w:val="00DB004E"/>
     <w:rPr>
@@ -14446,10 +14696,10 @@
       <w:szCs w:val="40"/>
     </w:rPr>
   </w:style>
-  <w:style w:type="character" w:customStyle="1" w:styleId="Heading2Char">
-    <w:name w:val="Heading 2 Char"/>
-    <w:basedOn w:val="DefaultParagraphFont"/>
-    <w:link w:val="Heading2"/>
+  <w:style w:type="character" w:customStyle="1" w:styleId="Balk2Char">
+    <w:name w:val="Başlık 2 Char"/>
+    <w:basedOn w:val="VarsaylanParagrafYazTipi"/>
+    <w:link w:val="Balk2"/>
     <w:uiPriority w:val="9"/>
     <w:semiHidden/>
     <w:rsid w:val="00DB004E"/>
@@ -14460,10 +14710,10 @@
       <w:szCs w:val="32"/>
     </w:rPr>
   </w:style>
-  <w:style w:type="character" w:customStyle="1" w:styleId="Heading3Char">
-    <w:name w:val="Heading 3 Char"/>
-    <w:basedOn w:val="DefaultParagraphFont"/>
-    <w:link w:val="Heading3"/>
+  <w:style w:type="character" w:customStyle="1" w:styleId="Balk3Char">
+    <w:name w:val="Başlık 3 Char"/>
+    <w:basedOn w:val="VarsaylanParagrafYazTipi"/>
+    <w:link w:val="Balk3"/>
     <w:uiPriority w:val="9"/>
     <w:semiHidden/>
     <w:rsid w:val="00DB004E"/>
@@ -14474,10 +14724,10 @@
       <w:szCs w:val="28"/>
     </w:rPr>
   </w:style>
-  <w:style w:type="character" w:customStyle="1" w:styleId="Heading4Char">
-    <w:name w:val="Heading 4 Char"/>
-    <w:basedOn w:val="DefaultParagraphFont"/>
-    <w:link w:val="Heading4"/>
+  <w:style w:type="character" w:customStyle="1" w:styleId="Balk4Char">
+    <w:name w:val="Başlık 4 Char"/>
+    <w:basedOn w:val="VarsaylanParagrafYazTipi"/>
+    <w:link w:val="Balk4"/>
     <w:uiPriority w:val="9"/>
     <w:semiHidden/>
     <w:rsid w:val="00DB004E"/>
@@ -14488,10 +14738,10 @@
       <w:color w:val="0F4761" w:themeColor="accent1" w:themeShade="BF"/>
     </w:rPr>
   </w:style>
-  <w:style w:type="character" w:customStyle="1" w:styleId="Heading5Char">
-    <w:name w:val="Heading 5 Char"/>
-    <w:basedOn w:val="DefaultParagraphFont"/>
-    <w:link w:val="Heading5"/>
+  <w:style w:type="character" w:customStyle="1" w:styleId="Balk5Char">
+    <w:name w:val="Başlık 5 Char"/>
+    <w:basedOn w:val="VarsaylanParagrafYazTipi"/>
+    <w:link w:val="Balk5"/>
     <w:uiPriority w:val="9"/>
     <w:semiHidden/>
     <w:rsid w:val="00DB004E"/>
@@ -14500,10 +14750,10 @@
       <w:color w:val="0F4761" w:themeColor="accent1" w:themeShade="BF"/>
     </w:rPr>
   </w:style>
-  <w:style w:type="character" w:customStyle="1" w:styleId="Heading6Char">
-    <w:name w:val="Heading 6 Char"/>
-    <w:basedOn w:val="DefaultParagraphFont"/>
-    <w:link w:val="Heading6"/>
+  <w:style w:type="character" w:customStyle="1" w:styleId="Balk6Char">
+    <w:name w:val="Başlık 6 Char"/>
+    <w:basedOn w:val="VarsaylanParagrafYazTipi"/>
+    <w:link w:val="Balk6"/>
     <w:uiPriority w:val="9"/>
     <w:semiHidden/>
     <w:rsid w:val="00DB004E"/>
@@ -14514,10 +14764,10 @@
       <w:color w:val="595959" w:themeColor="text1" w:themeTint="A6"/>
     </w:rPr>
   </w:style>
-  <w:style w:type="character" w:customStyle="1" w:styleId="Heading7Char">
-    <w:name w:val="Heading 7 Char"/>
-    <w:basedOn w:val="DefaultParagraphFont"/>
-    <w:link w:val="Heading7"/>
+  <w:style w:type="character" w:customStyle="1" w:styleId="Balk7Char">
+    <w:name w:val="Başlık 7 Char"/>
+    <w:basedOn w:val="VarsaylanParagrafYazTipi"/>
+    <w:link w:val="Balk7"/>
     <w:uiPriority w:val="9"/>
     <w:semiHidden/>
     <w:rsid w:val="00DB004E"/>
@@ -14526,10 +14776,10 @@
       <w:color w:val="595959" w:themeColor="text1" w:themeTint="A6"/>
     </w:rPr>
   </w:style>
-  <w:style w:type="character" w:customStyle="1" w:styleId="Heading8Char">
-    <w:name w:val="Heading 8 Char"/>
-    <w:basedOn w:val="DefaultParagraphFont"/>
-    <w:link w:val="Heading8"/>
+  <w:style w:type="character" w:customStyle="1" w:styleId="Balk8Char">
+    <w:name w:val="Başlık 8 Char"/>
+    <w:basedOn w:val="VarsaylanParagrafYazTipi"/>
+    <w:link w:val="Balk8"/>
     <w:uiPriority w:val="9"/>
     <w:semiHidden/>
     <w:rsid w:val="00DB004E"/>
@@ -14540,10 +14790,10 @@
       <w:color w:val="272727" w:themeColor="text1" w:themeTint="D8"/>
     </w:rPr>
   </w:style>
-  <w:style w:type="character" w:customStyle="1" w:styleId="Heading9Char">
-    <w:name w:val="Heading 9 Char"/>
-    <w:basedOn w:val="DefaultParagraphFont"/>
-    <w:link w:val="Heading9"/>
+  <w:style w:type="character" w:customStyle="1" w:styleId="Balk9Char">
+    <w:name w:val="Başlık 9 Char"/>
+    <w:basedOn w:val="VarsaylanParagrafYazTipi"/>
+    <w:link w:val="Balk9"/>
     <w:uiPriority w:val="9"/>
     <w:semiHidden/>
     <w:rsid w:val="00DB004E"/>
@@ -14552,11 +14802,11 @@
       <w:color w:val="272727" w:themeColor="text1" w:themeTint="D8"/>
     </w:rPr>
   </w:style>
-  <w:style w:type="paragraph" w:styleId="Title">
+  <w:style w:type="paragraph" w:styleId="KonuBal">
     <w:name w:val="Title"/>
     <w:basedOn w:val="Normal"/>
     <w:next w:val="Normal"/>
-    <w:link w:val="TitleChar"/>
+    <w:link w:val="KonuBalChar"/>
     <w:uiPriority w:val="10"/>
     <w:qFormat/>
     <w:rsid w:val="00DB004E"/>
@@ -14572,10 +14822,10 @@
       <w:szCs w:val="56"/>
     </w:rPr>
   </w:style>
-  <w:style w:type="character" w:customStyle="1" w:styleId="TitleChar">
-    <w:name w:val="Title Char"/>
-    <w:basedOn w:val="DefaultParagraphFont"/>
-    <w:link w:val="Title"/>
+  <w:style w:type="character" w:customStyle="1" w:styleId="KonuBalChar">
+    <w:name w:val="Konu Başlığı Char"/>
+    <w:basedOn w:val="VarsaylanParagrafYazTipi"/>
+    <w:link w:val="KonuBal"/>
     <w:uiPriority w:val="10"/>
     <w:rsid w:val="00DB004E"/>
     <w:rPr>
@@ -14586,11 +14836,11 @@
       <w:szCs w:val="56"/>
     </w:rPr>
   </w:style>
-  <w:style w:type="paragraph" w:styleId="Subtitle">
+  <w:style w:type="paragraph" w:styleId="Altyaz">
     <w:name w:val="Subtitle"/>
     <w:basedOn w:val="Normal"/>
     <w:next w:val="Normal"/>
-    <w:link w:val="SubtitleChar"/>
+    <w:link w:val="AltyazChar"/>
     <w:uiPriority w:val="11"/>
     <w:qFormat/>
     <w:rsid w:val="00DB004E"/>
@@ -14607,10 +14857,10 @@
       <w:szCs w:val="28"/>
     </w:rPr>
   </w:style>
-  <w:style w:type="character" w:customStyle="1" w:styleId="SubtitleChar">
-    <w:name w:val="Subtitle Char"/>
-    <w:basedOn w:val="DefaultParagraphFont"/>
-    <w:link w:val="Subtitle"/>
+  <w:style w:type="character" w:customStyle="1" w:styleId="AltyazChar">
+    <w:name w:val="Altyazı Char"/>
+    <w:basedOn w:val="VarsaylanParagrafYazTipi"/>
+    <w:link w:val="Altyaz"/>
     <w:uiPriority w:val="11"/>
     <w:rsid w:val="00DB004E"/>
     <w:rPr>
@@ -14621,11 +14871,11 @@
       <w:szCs w:val="28"/>
     </w:rPr>
   </w:style>
-  <w:style w:type="paragraph" w:styleId="Quote">
+  <w:style w:type="paragraph" w:styleId="Alnt">
     <w:name w:val="Quote"/>
     <w:basedOn w:val="Normal"/>
     <w:next w:val="Normal"/>
-    <w:link w:val="QuoteChar"/>
+    <w:link w:val="AlntChar"/>
     <w:uiPriority w:val="29"/>
     <w:qFormat/>
     <w:rsid w:val="00DB004E"/>
@@ -14639,10 +14889,10 @@
       <w:color w:val="404040" w:themeColor="text1" w:themeTint="BF"/>
     </w:rPr>
   </w:style>
-  <w:style w:type="character" w:customStyle="1" w:styleId="QuoteChar">
-    <w:name w:val="Quote Char"/>
-    <w:basedOn w:val="DefaultParagraphFont"/>
-    <w:link w:val="Quote"/>
+  <w:style w:type="character" w:customStyle="1" w:styleId="AlntChar">
+    <w:name w:val="Alıntı Char"/>
+    <w:basedOn w:val="VarsaylanParagrafYazTipi"/>
+    <w:link w:val="Alnt"/>
     <w:uiPriority w:val="29"/>
     <w:rsid w:val="00DB004E"/>
     <w:rPr>
@@ -14651,7 +14901,7 @@
       <w:color w:val="404040" w:themeColor="text1" w:themeTint="BF"/>
     </w:rPr>
   </w:style>
-  <w:style w:type="paragraph" w:styleId="ListParagraph">
+  <w:style w:type="paragraph" w:styleId="ListeParagraf">
     <w:name w:val="List Paragraph"/>
     <w:basedOn w:val="Normal"/>
     <w:uiPriority w:val="34"/>
@@ -14662,9 +14912,9 @@
       <w:contextualSpacing/>
     </w:pPr>
   </w:style>
-  <w:style w:type="character" w:styleId="IntenseEmphasis">
+  <w:style w:type="character" w:styleId="GlVurgulama">
     <w:name w:val="Intense Emphasis"/>
-    <w:basedOn w:val="DefaultParagraphFont"/>
+    <w:basedOn w:val="VarsaylanParagrafYazTipi"/>
     <w:uiPriority w:val="21"/>
     <w:qFormat/>
     <w:rsid w:val="00DB004E"/>
@@ -14674,11 +14924,11 @@
       <w:color w:val="0F4761" w:themeColor="accent1" w:themeShade="BF"/>
     </w:rPr>
   </w:style>
-  <w:style w:type="paragraph" w:styleId="IntenseQuote">
+  <w:style w:type="paragraph" w:styleId="GlAlnt">
     <w:name w:val="Intense Quote"/>
     <w:basedOn w:val="Normal"/>
     <w:next w:val="Normal"/>
-    <w:link w:val="IntenseQuoteChar"/>
+    <w:link w:val="GlAlntChar"/>
     <w:uiPriority w:val="30"/>
     <w:qFormat/>
     <w:rsid w:val="00DB004E"/>
@@ -14697,10 +14947,10 @@
       <w:color w:val="0F4761" w:themeColor="accent1" w:themeShade="BF"/>
     </w:rPr>
   </w:style>
-  <w:style w:type="character" w:customStyle="1" w:styleId="IntenseQuoteChar">
-    <w:name w:val="Intense Quote Char"/>
-    <w:basedOn w:val="DefaultParagraphFont"/>
-    <w:link w:val="IntenseQuote"/>
+  <w:style w:type="character" w:customStyle="1" w:styleId="GlAlntChar">
+    <w:name w:val="Güçlü Alıntı Char"/>
+    <w:basedOn w:val="VarsaylanParagrafYazTipi"/>
+    <w:link w:val="GlAlnt"/>
     <w:uiPriority w:val="30"/>
     <w:rsid w:val="00DB004E"/>
     <w:rPr>
@@ -14709,9 +14959,9 @@
       <w:color w:val="0F4761" w:themeColor="accent1" w:themeShade="BF"/>
     </w:rPr>
   </w:style>
-  <w:style w:type="character" w:styleId="IntenseReference">
+  <w:style w:type="character" w:styleId="GlBavuru">
     <w:name w:val="Intense Reference"/>
-    <w:basedOn w:val="DefaultParagraphFont"/>
+    <w:basedOn w:val="VarsaylanParagrafYazTipi"/>
     <w:uiPriority w:val="32"/>
     <w:qFormat/>
     <w:rsid w:val="00DB004E"/>
@@ -14754,7 +15004,7 @@
   </w:style>
   <w:style w:type="character" w:customStyle="1" w:styleId="Stil1Char">
     <w:name w:val="Stil1 Char"/>
-    <w:basedOn w:val="DefaultParagraphFont"/>
+    <w:basedOn w:val="VarsaylanParagrafYazTipi"/>
     <w:link w:val="Stil1"/>
     <w:rsid w:val="00B72D8C"/>
     <w:rPr>
@@ -14777,7 +15027,7 @@
       <w:szCs w:val="36"/>
     </w:rPr>
   </w:style>
-  <w:style w:type="paragraph" w:styleId="TOC1">
+  <w:style w:type="paragraph" w:styleId="T1">
     <w:name w:val="toc 1"/>
     <w:basedOn w:val="Normal"/>
     <w:next w:val="Normal"/>
@@ -14789,7 +15039,7 @@
       <w:spacing w:after="100"/>
     </w:pPr>
   </w:style>
-  <w:style w:type="paragraph" w:styleId="TOC2">
+  <w:style w:type="paragraph" w:styleId="T2">
     <w:name w:val="toc 2"/>
     <w:basedOn w:val="Normal"/>
     <w:next w:val="Normal"/>
@@ -14802,9 +15052,9 @@
       <w:ind w:left="240"/>
     </w:pPr>
   </w:style>
-  <w:style w:type="character" w:styleId="Hyperlink">
+  <w:style w:type="character" w:styleId="Kpr">
     <w:name w:val="Hyperlink"/>
-    <w:basedOn w:val="DefaultParagraphFont"/>
+    <w:basedOn w:val="VarsaylanParagrafYazTipi"/>
     <w:uiPriority w:val="99"/>
     <w:unhideWhenUsed/>
     <w:rsid w:val="00B72D8C"/>
@@ -14813,10 +15063,10 @@
       <w:u w:val="single"/>
     </w:rPr>
   </w:style>
-  <w:style w:type="paragraph" w:styleId="Header">
+  <w:style w:type="paragraph" w:styleId="stBilgi">
     <w:name w:val="header"/>
     <w:basedOn w:val="Normal"/>
-    <w:link w:val="HeaderChar"/>
+    <w:link w:val="stBilgiChar"/>
     <w:uiPriority w:val="99"/>
     <w:unhideWhenUsed/>
     <w:rsid w:val="00A70E40"/>
@@ -14828,17 +15078,17 @@
       <w:spacing w:after="0" w:line="240" w:lineRule="auto"/>
     </w:pPr>
   </w:style>
-  <w:style w:type="character" w:customStyle="1" w:styleId="HeaderChar">
-    <w:name w:val="Header Char"/>
-    <w:basedOn w:val="DefaultParagraphFont"/>
-    <w:link w:val="Header"/>
+  <w:style w:type="character" w:customStyle="1" w:styleId="stBilgiChar">
+    <w:name w:val="Üst Bilgi Char"/>
+    <w:basedOn w:val="VarsaylanParagrafYazTipi"/>
+    <w:link w:val="stBilgi"/>
     <w:uiPriority w:val="99"/>
     <w:rsid w:val="00A70E40"/>
   </w:style>
-  <w:style w:type="paragraph" w:styleId="Footer">
+  <w:style w:type="paragraph" w:styleId="AltBilgi">
     <w:name w:val="footer"/>
     <w:basedOn w:val="Normal"/>
-    <w:link w:val="FooterChar"/>
+    <w:link w:val="AltBilgiChar"/>
     <w:uiPriority w:val="99"/>
     <w:unhideWhenUsed/>
     <w:rsid w:val="00A70E40"/>
@@ -14850,16 +15100,16 @@
       <w:spacing w:after="0" w:line="240" w:lineRule="auto"/>
     </w:pPr>
   </w:style>
-  <w:style w:type="character" w:customStyle="1" w:styleId="FooterChar">
-    <w:name w:val="Footer Char"/>
-    <w:basedOn w:val="DefaultParagraphFont"/>
-    <w:link w:val="Footer"/>
+  <w:style w:type="character" w:customStyle="1" w:styleId="AltBilgiChar">
+    <w:name w:val="Alt Bilgi Char"/>
+    <w:basedOn w:val="VarsaylanParagrafYazTipi"/>
+    <w:link w:val="AltBilgi"/>
     <w:uiPriority w:val="99"/>
     <w:rsid w:val="00A70E40"/>
   </w:style>
-  <w:style w:type="paragraph" w:styleId="TOCHeading">
+  <w:style w:type="paragraph" w:styleId="TBal">
     <w:name w:val="TOC Heading"/>
-    <w:basedOn w:val="Heading1"/>
+    <w:basedOn w:val="Balk1"/>
     <w:next w:val="Normal"/>
     <w:uiPriority w:val="39"/>
     <w:unhideWhenUsed/>
@@ -14877,9 +15127,9 @@
       <w14:ligatures w14:val="none"/>
     </w:rPr>
   </w:style>
-  <w:style w:type="character" w:styleId="UnresolvedMention">
+  <w:style w:type="character" w:styleId="zmlenmeyenBahsetme">
     <w:name w:val="Unresolved Mention"/>
-    <w:basedOn w:val="DefaultParagraphFont"/>
+    <w:basedOn w:val="VarsaylanParagrafYazTipi"/>
     <w:uiPriority w:val="99"/>
     <w:semiHidden/>
     <w:unhideWhenUsed/>

</xml_diff>